<commit_message>
fix(redteam): autonomously arm complete validation coverage
</commit_message>
<xml_diff>
--- a/Angerona_Master_Manual.docx
+++ b/Angerona_Master_Manual.docx
@@ -10969,6 +10969,82 @@
     </w:p>
     <w:p>
       <w:pPr>
+        <w:pStyle w:val="Heading2"/>
+      </w:pPr>
+      <w:r>
+        <w:t>17.2 Automatic Red Team validation correction (2026-08-25)</w:t>
+      </w:r>
+    </w:p>
+    <w:p>
+      <w:pPr/>
+      <w:r>
+        <w:t>A live Extreme GUI campaign exposed a launch-contract defect: Auto-contain armed the response tier but did not activate Purple Guard's fixed simulation detector pack. The report therefore recorded only 4/52 eligible detections. This was a real validation-path failure, not acceptable detector latency.</w:t>
+      </w:r>
+    </w:p>
+    <w:p>
+      <w:pPr>
+        <w:pStyle w:val="ListBullet"/>
+      </w:pPr>
+      <w:r>
+        <w:t>Corrected launch behavior: an Auto-contain Red Team run activates all 13 reviewed simulation-only technique signatures before the first marker is created. Activation preserves earlier signed candidate lineage and fails closed if the pack cannot be persisted.</w:t>
+      </w:r>
+    </w:p>
+    <w:p>
+      <w:pPr>
+        <w:pStyle w:val="ListBullet"/>
+      </w:pPr>
+      <w:r>
+        <w:t>Scope remains exact: the pack recognizes only inert _redteam_* artifacts in the dedicated or explicitly registered drill target and nonce-tagged idle processes. It does not convert suspicious filenames elsewhere into host-wide threat authority.</w:t>
+      </w:r>
+    </w:p>
+    <w:p>
+      <w:pPr>
+        <w:pStyle w:val="ListBullet"/>
+      </w:pPr>
+      <w:r>
+        <w:t>AAR correlation now prefers the exact Adversary Combat receipt with a verified postcondition over an earlier delegation wrapper. A real verified Combat receipt counts as both an applied action contract and a closure.</w:t>
+      </w:r>
+    </w:p>
+    <w:p>
+      <w:pPr>
+        <w:pStyle w:val="ListBullet"/>
+      </w:pPr>
+      <w:r>
+        <w:t>The first corrected live round achieved 52/52 detection but only 51/52 response and 12/13 closure, so the validator rejected it and automatically continued.</w:t>
+      </w:r>
+    </w:p>
+    <w:p>
+      <w:pPr>
+        <w:pStyle w:val="ListBullet"/>
+      </w:pPr>
+      <w:r>
+        <w:t>The second round, run redteam-1787697587-bf119f, achieved 52/52 detection, 52/52 automatic response, 13/13 action contracts, 13/13 verified closure, and a passing no-false-alert resilience control. Average detection was 0.57 seconds and average mitigation was 1.09 seconds.</w:t>
+      </w:r>
+    </w:p>
+    <w:p>
+      <w:pPr>
+        <w:pStyle w:val="ListBullet"/>
+      </w:pPr>
+      <w:r>
+        <w:t>Post-run cleanup verified 223 authenticated action records, zero active reversible actions, an empty journal error, zero recovery requirements, zero remaining drill markers, and zero tagged probe processes.</w:t>
+      </w:r>
+    </w:p>
+    <w:p>
+      <w:pPr>
+        <w:pStyle w:val="ListBullet"/>
+      </w:pPr>
+      <w:r>
+        <w:t>Regression evidence: 1,257 tests passed with three intentional platform skips; 308 Python files compiled; repository-wide Ruff checks passed; the headless application self-check passed 26/26; and 128 adversary-boundary negative controls passed before the live campaign.</w:t>
+      </w:r>
+    </w:p>
+    <w:p>
+      <w:pPr/>
+      <w:r>
+        <w:t>Interpretation limit: this proves 100% end-to-end handling of the defined 13-class, 52-step inert campaign. It is not a claim that any finite product detects every possible real-world threat.</w:t>
+      </w:r>
+    </w:p>
+    <w:p>
+      <w:pPr>
         <w:pStyle w:val="Heading1"/>
         <w:pageBreakBefore/>
       </w:pPr>

</xml_diff>

<commit_message>
feat(settings): open each tab in source sandbox
</commit_message>
<xml_diff>
--- a/Angerona_Master_Manual.docx
+++ b/Angerona_Master_Manual.docx
@@ -11045,6 +11045,60 @@
     </w:p>
     <w:p>
       <w:pPr>
+        <w:pStyle w:val="Heading2"/>
+      </w:pPr>
+      <w:r>
+        <w:t>17.3 Tab-aware Settings code sandbox (2026-08-25)</w:t>
+      </w:r>
+    </w:p>
+    <w:p>
+      <w:pPr/>
+      <w:r>
+        <w:t>Every functional tab in Settings now exposes a tab-aware code-sandbox button. The button follows the selected tab, resolves its registered implementation files, opens isolated editable working copies, and places the editor at the corresponding tab-builder code.</w:t>
+      </w:r>
+    </w:p>
+    <w:p>
+      <w:pPr>
+        <w:pStyle w:val="ListBullet"/>
+      </w:pPr>
+      <w:r>
+        <w:t>Covered tabs: Overview, Information, General, System, Adversary Combat, Enterprise, ARIA, Trusted Processes, Mobile Integration, and API Keys.</w:t>
+      </w:r>
+    </w:p>
+    <w:p>
+      <w:pPr>
+        <w:pStyle w:val="ListBullet"/>
+      </w:pPr>
+      <w:r>
+        <w:t>Each sandbox includes the tab's related implementation files in a picker. For example, ARIA opens the Settings UI at _tab_aria and also exposes its assistant and configuration implementation files.</w:t>
+      </w:r>
+    </w:p>
+    <w:p>
+      <w:pPr>
+        <w:pStyle w:val="ListBullet"/>
+      </w:pPr>
+      <w:r>
+        <w:t>Check Syntax, Save Sandbox Copy, Reset Current Copy, and Reset All Sandbox Changes operate only on the private working copy. Installed Angerona code and live sensors are never rewritten or hot-loaded by this editor.</w:t>
+      </w:r>
+    </w:p>
+    <w:p>
+      <w:pPr>
+        <w:pStyle w:val="ListBullet"/>
+      </w:pPr>
+      <w:r>
+        <w:t>The Adversary Combat Settings topic now has a complete source mapping for its policy, action, receipt, history, and Undo implementation.</w:t>
+      </w:r>
+    </w:p>
+    <w:p>
+      <w:pPr>
+        <w:pStyle w:val="ListBullet"/>
+      </w:pPr>
+      <w:r>
+        <w:t>Verification: 49 focused Settings/UI regression tests passed; the full suite passed 1,258 tests with three intentional platform skips; Ruff and documentation-drift checks passed.</w:t>
+      </w:r>
+    </w:p>
+    <w:p>
+      <w:pPr>
         <w:pStyle w:val="Heading1"/>
         <w:pageBreakBefore/>
       </w:pPr>

</xml_diff>

<commit_message>
feat: add App Control evidence and close UI audit
</commit_message>
<xml_diff>
--- a/Angerona_Master_Manual.docx
+++ b/Angerona_Master_Manual.docx
@@ -109,23 +109,8 @@
             <w:shd w:fill="FFF6DF"/>
           </w:tcPr>
           <w:p>
-            <w:pPr>
-              <w:spacing w:after="0"/>
-            </w:pPr>
             <w:r>
-              <w:rPr>
-                <w:rFonts w:ascii="Calibri" w:hAnsi="Calibri" w:eastAsia="Calibri"/>
-                <w:b/>
-                <w:color w:val="C58B2A"/>
-              </w:rPr>
-              <w:t xml:space="preserve">Current release: </w:t>
-            </w:r>
-            <w:r>
-              <w:rPr>
-                <w:rFonts w:ascii="Calibri" w:hAnsi="Calibri" w:eastAsia="Calibri"/>
-                <w:color w:val="243447"/>
-              </w:rPr>
-              <w:t>v1.10.2 - governed autonomous Adversary Combat, receipt-bound SOAR, typed ARIA authority, attested Ollama model packs, expanded Windows telemetry, and a frozen zero-failure automated gate.</w:t>
+              <w:t>Current release: v1.10.3 - governed autonomous Adversary Combat, receipt-bound SOAR, typed ARIA authority, authenticated App Control decision evidence, exhaustive UI contracts, and a frozen zero-failure gate.</w:t>
             </w:r>
           </w:p>
         </w:tc>
@@ -297,16 +282,8 @@
             </w:tcMar>
           </w:tcPr>
           <w:p>
-            <w:pPr>
-              <w:spacing w:after="0" w:line="264" w:lineRule="auto"/>
-            </w:pPr>
             <w:r>
-              <w:rPr>
-                <w:rFonts w:ascii="Calibri" w:hAnsi="Calibri" w:eastAsia="Calibri"/>
-                <w:color w:val="243447"/>
-                <w:sz w:val="18"/>
-              </w:rPr>
-              <w:t>1.10.2</w:t>
+              <w:t>1.10.3</w:t>
             </w:r>
           </w:p>
         </w:tc>
@@ -828,7 +805,7 @@
           <w:color w:val="243447"/>
           <w:sz w:val="19"/>
         </w:rPr>
-        <w:t>10. Host Adaption, resilience, and resource governance</w:t>
+        <w:t>10. Host Adaptation, resilience, and resource governance</w:t>
       </w:r>
     </w:p>
     <w:p>
@@ -991,7 +968,7 @@
           <w:i w:val="0"/>
           <w:color w:val="243447"/>
         </w:rPr>
-        <w:t>Angerona unifies Windows endpoint and network visibility, local evidence retention, case work, MITRE ATT&amp;CK mapping, governed containment, recovery, local AI assistance, and non-destructive purple-team validation. Its 67 discovered modules share a typed EventBus and explicit platform contracts.</w:t>
+        <w:t>Angerona unifies Windows endpoint and network visibility, local evidence retention, case work, MITRE ATT&amp;CK mapping, governed containment, recovery, local AI assistance, and non-destructive purple-team validation. Its 68 discovered modules share a typed EventBus and explicit platform contracts.</w:t>
       </w:r>
     </w:p>
     <w:tbl>
@@ -2431,16 +2408,8 @@
             </w:tcMar>
           </w:tcPr>
           <w:p>
-            <w:pPr>
-              <w:spacing w:after="0" w:line="264" w:lineRule="auto"/>
-            </w:pPr>
             <w:r>
-              <w:rPr>
-                <w:rFonts w:ascii="Calibri" w:hAnsi="Calibri" w:eastAsia="Calibri"/>
-                <w:color w:val="243447"/>
-                <w:sz w:val="17"/>
-              </w:rPr>
-              <w:t>ETW, Sysmon, WFP, Defender, process/file/network, platform observers</w:t>
+              <w:t>ETW, Sysmon, WFP, Defender, App Control/Code Integrity, process/file/network, and platform observers</w:t>
             </w:r>
           </w:p>
         </w:tc>
@@ -2961,11 +2930,13 @@
           <w:ilvl w:val="0"/>
           <w:numId w:val="10"/>
         </w:numPr>
+        <w:spacing w:before="0" w:after="0" w:line="240" w:lineRule="auto"/>
       </w:pPr>
       <w:r>
         <w:rPr>
           <w:rFonts w:ascii="Calibri" w:hAnsi="Calibri" w:eastAsia="Calibri"/>
           <w:color w:val="243447"/>
+          <w:sz w:val="19"/>
         </w:rPr>
         <w:t>src/angerona/core - event, storage, response, ARIA, model-pack, policy, credential, evidence, and interoperability primitives.</w:t>
       </w:r>
@@ -2976,11 +2947,13 @@
           <w:ilvl w:val="0"/>
           <w:numId w:val="10"/>
         </w:numPr>
+        <w:spacing w:before="0" w:after="0" w:line="240" w:lineRule="auto"/>
       </w:pPr>
       <w:r>
         <w:rPr>
           <w:rFonts w:ascii="Calibri" w:hAnsi="Calibri" w:eastAsia="Calibri"/>
           <w:color w:val="243447"/>
+          <w:sz w:val="19"/>
         </w:rPr>
         <w:t>src/angerona/modules - built-in detectors, observers, response and resilience modules.</w:t>
       </w:r>
@@ -2991,11 +2964,13 @@
           <w:ilvl w:val="0"/>
           <w:numId w:val="10"/>
         </w:numPr>
+        <w:spacing w:before="0" w:after="0" w:line="240" w:lineRule="auto"/>
       </w:pPr>
       <w:r>
         <w:rPr>
           <w:rFonts w:ascii="Calibri" w:hAnsi="Calibri" w:eastAsia="Calibri"/>
           <w:color w:val="243447"/>
+          <w:sz w:val="19"/>
         </w:rPr>
         <w:t>src/angerona/gui - Classic and Flow dashboards, settings, operations, Red Team, Combat history, and Upgrade Console.</w:t>
       </w:r>
@@ -3006,11 +2981,13 @@
           <w:ilvl w:val="0"/>
           <w:numId w:val="10"/>
         </w:numPr>
+        <w:spacing w:before="0" w:after="0" w:line="240" w:lineRule="auto"/>
       </w:pPr>
       <w:r>
         <w:rPr>
           <w:rFonts w:ascii="Calibri" w:hAnsi="Calibri" w:eastAsia="Calibri"/>
           <w:color w:val="243447"/>
+          <w:sz w:val="19"/>
         </w:rPr>
         <w:t>src/angerona/shark - Shark Attack, Red Team simulation, and After-Action Reports.</w:t>
       </w:r>
@@ -3531,7 +3508,7 @@
           <w:i w:val="0"/>
           <w:color w:val="243447"/>
         </w:rPr>
-        <w:t>Angerona exposes seven canonical Info/menu sections, plus dedicated Host Adaption and Adversary Combat surfaces. Labels below are destinations, not separate trust domains.</w:t>
+        <w:t>Angerona exposes seven canonical Info/menu sections, plus dedicated Host Adaptation and Adversary Combat surfaces. Labels below are destinations, not separate trust domains.</w:t>
       </w:r>
     </w:p>
     <w:tbl>
@@ -4215,7 +4192,7 @@
                 <w:color w:val="243447"/>
                 <w:sz w:val="17"/>
               </w:rPr>
-              <w:t>Host Adaption</w:t>
+              <w:t>Host Adaptation</w:t>
             </w:r>
           </w:p>
         </w:tc>
@@ -4813,6 +4790,18 @@
           <w:color w:val="243447"/>
         </w:rPr>
         <w:t>Sysmon event IDs 1-29 plus 255, bounded XML parsing, and an HMAC-authenticated restart cursor.</w:t>
+      </w:r>
+    </w:p>
+    <w:p>
+      <w:pPr/>
+      <w:r>
+        <w:t>Windows App Control/Code Integrity decisions distinguish audit would-block from enforced block outcomes and strictly join bounded 3089 signature evidence by ActivityID. Policy-health events remain separate from threat claims, and this read-only sensor cannot change policy or authorize response.</w:t>
+      </w:r>
+    </w:p>
+    <w:p>
+      <w:pPr/>
+      <w:r>
+        <w:t>The App Control cursor and incomplete joins are HMAC-authenticated and atomically persisted. Exact record anchors expose retention loss, clears, record-ID reuse, and generation changes before, during, or at the end of a poll. Ordinary UI/export details use basenames and keyed tokens instead of full local paths.</w:t>
       </w:r>
     </w:p>
     <w:p>
@@ -7269,7 +7258,7 @@
         <w:pageBreakBefore/>
       </w:pPr>
       <w:r>
-        <w:t>10. Host Adaption, resilience, and resource governance</w:t>
+        <w:t>10. Host Adaptation, resilience, and resource governance</w:t>
       </w:r>
     </w:p>
     <w:p>
@@ -7277,7 +7266,7 @@
         <w:pStyle w:val="Heading2"/>
       </w:pPr>
       <w:r>
-        <w:t>10.1 Host Adaption</w:t>
+        <w:t>10.1 Host Adaptation</w:t>
       </w:r>
     </w:p>
     <w:p>
@@ -7287,7 +7276,7 @@
           <w:i w:val="0"/>
           <w:color w:val="243447"/>
         </w:rPr>
-        <w:t>Host Adaption inventories hardware, services, listeners, network context, effective Firewall ActiveStore profiles, and a bounded rule set. It captures baselines, reports drift and collector quality, previews closed firewall-only profiles, simulates without writes, applies only after exact confirmation and verified backup, and rolls back with signed artifact verification.</w:t>
+        <w:t>Host Adaptation inventories hardware, services, listeners, network context, effective Firewall ActiveStore profiles, and a bounded rule set. It captures baselines, reports drift and collector quality, previews closed firewall-only profiles, simulates without writes, applies only after exact confirmation and verified backup, and rolls back with signed artifact verification.</w:t>
       </w:r>
     </w:p>
     <w:p>
@@ -7839,16 +7828,8 @@
             </w:tcMar>
           </w:tcPr>
           <w:p>
-            <w:pPr>
-              <w:spacing w:after="0" w:line="264" w:lineRule="auto"/>
-            </w:pPr>
             <w:r>
-              <w:rPr>
-                <w:rFonts w:ascii="Calibri" w:hAnsi="Calibri" w:eastAsia="Calibri"/>
-                <w:color w:val="243447"/>
-                <w:sz w:val="17"/>
-              </w:rPr>
-              <w:t>1,258 collected across 197 files; 1,255 passed; 3 intentional skips; 0 failed</w:t>
+              <w:t>1,308 collected across 201 files; 1,305 passed; 3 intentional skips; 0 failed</w:t>
             </w:r>
           </w:p>
         </w:tc>
@@ -7893,16 +7874,8 @@
             </w:tcMar>
           </w:tcPr>
           <w:p>
-            <w:pPr>
-              <w:spacing w:after="0" w:line="264" w:lineRule="auto"/>
-            </w:pPr>
             <w:r>
-              <w:rPr>
-                <w:rFonts w:ascii="Calibri" w:hAnsi="Calibri" w:eastAsia="Calibri"/>
-                <w:color w:val="243447"/>
-                <w:sz w:val="17"/>
-              </w:rPr>
-              <w:t>308/308 Python files</w:t>
+              <w:t>310/310 product Python files</w:t>
             </w:r>
           </w:p>
         </w:tc>
@@ -7999,16 +7972,8 @@
             </w:tcMar>
           </w:tcPr>
           <w:p>
-            <w:pPr>
-              <w:spacing w:after="0" w:line="264" w:lineRule="auto"/>
-            </w:pPr>
             <w:r>
-              <w:rPr>
-                <w:rFonts w:ascii="Calibri" w:hAnsi="Calibri" w:eastAsia="Calibri"/>
-                <w:color w:val="243447"/>
-                <w:sz w:val="17"/>
-              </w:rPr>
-              <w:t>46 genuine pass; 0 genuine fail; 13 expected inactive; 8 platform/operator skips</w:t>
+              <w:t>48 genuine pass; 0 genuine fail; 13 expected inactive; 8 platform/operator skips</w:t>
             </w:r>
           </w:p>
         </w:tc>
@@ -8383,6 +8348,28 @@
           </w:p>
         </w:tc>
       </w:tr>
+      <w:tr>
+        <w:tc>
+          <w:tcPr>
+            <w:tcW w:type="dxa" w:w="2450"/>
+          </w:tcPr>
+          <w:p>
+            <w:r>
+              <w:t>App Control evidence</w:t>
+            </w:r>
+          </w:p>
+        </w:tc>
+        <w:tc>
+          <w:tcPr>
+            <w:tcW w:type="dxa" w:w="6910"/>
+          </w:tcPr>
+          <w:p>
+            <w:r>
+              <w:t>35/35 focused; live read-only sample 256/256 parsed and 107/107 complete correlations; independent late-clear fixture replayed 6/6 exactly once</w:t>
+            </w:r>
+          </w:p>
+        </w:tc>
+      </w:tr>
     </w:tbl>
     <w:p>
       <w:pPr>
@@ -8395,6 +8382,24 @@
       </w:pPr>
       <w:r>
         <w:t>13.1 Final bug closures</w:t>
+      </w:r>
+    </w:p>
+    <w:p>
+      <w:pPr/>
+      <w:r>
+        <w:t>App Control signature cardinality, restart persistence, hard bounds, path privacy, retained-range gaps, clear/refill, and checkpoint timing races now have deterministic regression coverage.</w:t>
+      </w:r>
+    </w:p>
+    <w:p>
+      <w:pPr/>
+      <w:r>
+        <w:t>Selfcheck uses structured skip classification and an explicit stopped-module allowlist; incidental timeout text and unknown stopped states cannot waive a real failure.</w:t>
+      </w:r>
+    </w:p>
+    <w:p>
+      <w:pPr/>
+      <w:r>
+        <w:t>Contextual Info, Settings source sandboxes, and the Red Team editor fail soft. A ContextInfo-owned timer closes cleanly during rapid heatmap/upgrade shutdown, and the ATT&amp;CK heatmap remains usable at 800x600.</w:t>
       </w:r>
     </w:p>
     <w:p>
@@ -9188,23 +9193,8 @@
             <w:shd w:fill="EAF5EF"/>
           </w:tcPr>
           <w:p>
-            <w:pPr>
-              <w:spacing w:after="0"/>
-            </w:pPr>
             <w:r>
-              <w:rPr>
-                <w:rFonts w:ascii="Calibri" w:hAnsi="Calibri" w:eastAsia="Calibri"/>
-                <w:b/>
-                <w:color w:val="1F6F50"/>
-              </w:rPr>
-              <w:t xml:space="preserve">Final red-team verdict: </w:t>
-            </w:r>
-            <w:r>
-              <w:rPr>
-                <w:rFonts w:ascii="Calibri" w:hAnsi="Calibri" w:eastAsia="Calibri"/>
-                <w:color w:val="243447"/>
-              </w:rPr>
-              <w:t>No open Critical, High, or Medium release blocker remains in the frozen v1.10.2 tree.</w:t>
+              <w:t>Final red-team verdict: No open Critical, High, or Medium release blocker remains in the frozen v1.10.3 deterministic tree. Physical WEVT lifecycle soak and the external gates below remain outstanding acceptance work.</w:t>
             </w:r>
           </w:p>
         </w:tc>
@@ -9341,12 +9331,7 @@
     </w:p>
     <w:p>
       <w:r>
-        <w:rPr>
-          <w:rFonts w:ascii="Calibri" w:hAnsi="Calibri" w:eastAsia="Calibri"/>
-          <w:i w:val="0"/>
-          <w:color w:val="243447"/>
-        </w:rPr>
-        <w:t>Primary-source comparison against Wazuh, Velociraptor, osquery/Fleet, Falco, Suricata, Zeek, Security Onion, Sigma, YARA-X, OCSF, STIX/TAXII, Microsoft telemetry, Ollama, SLSA, and OWASP GenAI produced a disciplined backlog. Unshipped items remain labeled proposals: strict signed Sigma 2.1 correlations, YARA-X cost admission, journal-backed ransomware attribution, bounded STIX/TAXII, signed Linux CO-RE sidecar, and additional provenance/lease depth.</w:t>
+        <w:t>The ranked next work is a digest-pinned ATT&amp;CK v19.2 registry, a protected PowerShell Operational/4104 sensor, an EPSS v5 + KEV + SSVC host-risk queue, event-driven Task Scheduler/BITS persistence evidence, and an App Control policy-inventory lifecycle. These are proposals, not current product claims.</w:t>
       </w:r>
     </w:p>
     <w:p>
@@ -10834,7 +10819,7 @@
                 <w:color w:val="243447"/>
                 <w:sz w:val="17"/>
               </w:rPr>
-              <w:t>Host Adaption workbench with audited firewall profiles, drift, preview, apply, automation, rollback, and recovery.</w:t>
+              <w:t>Host Adaptation workbench with audited firewall profiles, drift, preview, apply, automation, rollback, and recovery.</w:t>
             </w:r>
           </w:p>
         </w:tc>
@@ -10879,16 +10864,30 @@
             </w:tcMar>
           </w:tcPr>
           <w:p>
-            <w:pPr>
-              <w:spacing w:after="0" w:line="264" w:lineRule="auto"/>
-            </w:pPr>
             <w:r>
-              <w:rPr>
-                <w:rFonts w:ascii="Calibri" w:hAnsi="Calibri" w:eastAsia="Calibri"/>
-                <w:color w:val="243447"/>
-                <w:sz w:val="17"/>
-              </w:rPr>
-              <w:t>Governed autonomous Combat; signed exact contracts and receipts; typed ARIA; verified llama3 pack; Ollama process/path attestation; Sysmon 1-29+255; Community ID v1; OCSF 1.8; trust, credential, semantic-response, recovery, and performance hardening; frozen 1,255-pass gate.</w:t>
+              <w:t>Governed autonomous Combat; signed exact contracts and receipts; typed ARIA; verified llama3 pack; Ollama process/path attestation; Sysmon 1-29+255; Community ID v1; OCSF 1.8; trust, credential, semantic-response, recovery, and performance hardening; frozen 1,258-pass gate.</w:t>
+            </w:r>
+          </w:p>
+        </w:tc>
+      </w:tr>
+      <w:tr>
+        <w:tc>
+          <w:tcPr>
+            <w:tcW w:type="dxa" w:w="1550"/>
+          </w:tcPr>
+          <w:p>
+            <w:r>
+              <w:t>1.10.3</w:t>
+            </w:r>
+          </w:p>
+        </w:tc>
+        <w:tc>
+          <w:tcPr>
+            <w:tcW w:type="dxa" w:w="7810"/>
+          </w:tcPr>
+          <w:p>
+            <w:r>
+              <w:t>Authenticated App Control decision/signature evidence; clear/refill and restart continuity; exhaustive UI/sandbox contracts; fail-soft shutdown fixes; truthful selfcheck policy; 1,305-pass frozen gate.</w:t>
             </w:r>
           </w:p>
         </w:tc>
@@ -11095,6 +11094,38 @@
       </w:pPr>
       <w:r>
         <w:t>Verification: 49 focused Settings/UI regression tests passed; the full suite passed 1,258 tests with three intentional platform skips; Ruff and documentation-drift checks passed.</w:t>
+      </w:r>
+    </w:p>
+    <w:p>
+      <w:pPr>
+        <w:pStyle w:val="Heading2"/>
+      </w:pPr>
+      <w:r>
+        <w:t>17.4 v1.10.3 evidence and UI closure (2026-08-25)</w:t>
+      </w:r>
+    </w:p>
+    <w:p>
+      <w:pPr/>
+      <w:r>
+        <w:t>The highest-value researched evidence gap shipped as the App Control Decision Evidence sensor. Six adversarial design loops closed strict correlation, restart, privacy, clear/refill, and mid-checkpoint timing defects.</w:t>
+      </w:r>
+    </w:p>
+    <w:p>
+      <w:pPr/>
+      <w:r>
+        <w:t>The UI audit covered 46 construction paths, 46 tab sites, 244 button sites, 9 actions, 3 menus, and 32 Info topics. All 10 functional Settings tabs open their exact isolated sandbox sources; the focused UI gate passed 153/153.</w:t>
+      </w:r>
+    </w:p>
+    <w:p>
+      <w:pPr/>
+      <w:r>
+        <w:t>Final automated evidence is 1,305 passed and 3 intentional platform skips from 1,308 collected tests, 310/310 compiled product Python files, 68 modules with zero discovery errors, Ruff clean, and selfcheck 26/26.</w:t>
+      </w:r>
+    </w:p>
+    <w:p>
+      <w:pPr/>
+      <w:r>
+        <w:t>Limit: deterministic and read-only live-source evidence does not replace a physical Windows clear/rollover/restart/suspend-resume soak or independent real-world efficacy assessment.</w:t>
       </w:r>
     </w:p>
     <w:p>
@@ -12424,6 +12455,7 @@
       <w:headerReference w:type="default" r:id="rId9"/>
       <w:footerReference w:type="default" r:id="rId10"/>
       <w:footerReference w:type="first" r:id="rId11"/>
+      <w:headerReference w:type="first" r:id="rId12"/>
       <w:pgSz w:w="12240" w:h="15840"/>
       <w:pgMar w:top="1440" w:right="1440" w:bottom="1440" w:left="1440" w:header="708" w:footer="708" w:gutter="0"/>
       <w:cols w:space="720"/>
@@ -12530,7 +12562,7 @@
         <w:color w:val="667085"/>
         <w:sz w:val="17"/>
       </w:rPr>
-      <w:t>Angerona Suite  |  v1.10.2  |  25 August 2026</w:t>
+      <w:t>Angerona Suite  |  v1.10.3  |  25 August 2026</w:t>
     </w:r>
   </w:p>
 </w:ftr>
@@ -12550,8 +12582,18 @@
         <w:color w:val="667085"/>
         <w:sz w:val="17"/>
       </w:rPr>
-      <w:t>ANGERONA  |  MASTER MANUAL  |  v1.10.2</w:t>
+      <w:t>ANGERONA  |  MASTER MANUAL  |  v1.10.3</w:t>
     </w:r>
+  </w:p>
+</w:hdr>
+</file>
+
+<file path=word/header2.xml><?xml version="1.0" encoding="utf-8"?>
+<w:hdr xmlns:m="http://schemas.openxmlformats.org/officeDocument/2006/math" xmlns:mc="http://schemas.openxmlformats.org/markup-compatibility/2006" xmlns:mo="http://schemas.microsoft.com/office/mac/office/2008/main" xmlns:mv="urn:schemas-microsoft-com:mac:vml" xmlns:o="urn:schemas-microsoft-com:office:office" xmlns:r="http://schemas.openxmlformats.org/officeDocument/2006/relationships" xmlns:v="urn:schemas-microsoft-com:vml" xmlns:w10="urn:schemas-microsoft-com:office:word" xmlns:w14="http://schemas.microsoft.com/office/word/2010/wordml" xmlns:w="http://schemas.openxmlformats.org/wordprocessingml/2006/main" xmlns:wne="http://schemas.microsoft.com/office/word/2006/wordml" xmlns:wp14="http://schemas.microsoft.com/office/word/2010/wordprocessingDrawing" xmlns:wp="http://schemas.openxmlformats.org/drawingml/2006/wordprocessingDrawing" xmlns:wpc="http://schemas.microsoft.com/office/word/2010/wordprocessingCanvas" xmlns:wpg="http://schemas.microsoft.com/office/word/2010/wordprocessingGroup" xmlns:wpi="http://schemas.microsoft.com/office/word/2010/wordprocessingInk" xmlns:wps="http://schemas.microsoft.com/office/word/2010/wordprocessingShape" mc:Ignorable="w14 wp14">
+  <w:p>
+    <w:pPr>
+      <w:pStyle w:val="Header"/>
+    </w:pPr>
   </w:p>
 </w:hdr>
 </file>

</xml_diff>

<commit_message>
docs: add guarded Git sync commands to manual
</commit_message>
<xml_diff>
--- a/Angerona_Master_Manual.docx
+++ b/Angerona_Master_Manual.docx
@@ -10889,6 +10889,9 @@
             <w:r>
               <w:t>Authenticated App Control decision/signature evidence; clear/refill and restart continuity; exhaustive UI/sandbox contracts; fail-soft shutdown fixes; truthful selfcheck policy; 1,305-pass frozen gate.</w:t>
             </w:r>
+            <w:r>
+              <w:t xml:space="preserve"> Guarded GitHub sync now verifies a pinned Gitleaks binary, scans staged or incoming content before mutation, and restricts pulls to reviewed fast-forward updates.</w:t>
+            </w:r>
           </w:p>
         </w:tc>
       </w:tr>
@@ -11744,6 +11747,82 @@
                 <w:sz w:val="18"/>
               </w:rPr>
               <w:t>kill-all-angerona.bat</w:t>
+            </w:r>
+          </w:p>
+        </w:tc>
+      </w:tr>
+      <w:tr>
+        <w:tc>
+          <w:tcPr>
+            <w:tcW w:type="dxa" w:w="2800"/>
+            <w:shd w:fill="FAFBFC"/>
+            <w:vAlign w:val="center"/>
+            <w:tcMar>
+              <w:top w:w="80" w:type="dxa"/>
+              <w:bottom w:w="80" w:type="dxa"/>
+              <w:start w:w="120" w:type="dxa"/>
+              <w:end w:w="120" w:type="dxa"/>
+            </w:tcMar>
+          </w:tcPr>
+          <w:p>
+            <w:r>
+              <w:t>Guarded GitHub push</w:t>
+            </w:r>
+          </w:p>
+        </w:tc>
+        <w:tc>
+          <w:tcPr>
+            <w:tcW w:type="dxa" w:w="6560"/>
+            <w:shd w:fill="FAFBFC"/>
+            <w:vAlign w:val="center"/>
+            <w:tcMar>
+              <w:top w:w="80" w:type="dxa"/>
+              <w:bottom w:w="80" w:type="dxa"/>
+              <w:start w:w="120" w:type="dxa"/>
+              <w:end w:w="120" w:type="dxa"/>
+            </w:tcMar>
+          </w:tcPr>
+          <w:p>
+            <w:r>
+              <w:t>push-to-github.bat</w:t>
+            </w:r>
+          </w:p>
+        </w:tc>
+      </w:tr>
+      <w:tr>
+        <w:tc>
+          <w:tcPr>
+            <w:tcW w:type="dxa" w:w="2800"/>
+            <w:shd w:fill="FAFBFC"/>
+            <w:vAlign w:val="center"/>
+            <w:tcMar>
+              <w:top w:w="80" w:type="dxa"/>
+              <w:bottom w:w="80" w:type="dxa"/>
+              <w:start w:w="120" w:type="dxa"/>
+              <w:end w:w="120" w:type="dxa"/>
+            </w:tcMar>
+          </w:tcPr>
+          <w:p>
+            <w:r>
+              <w:t>Guarded GitHub pull</w:t>
+            </w:r>
+          </w:p>
+        </w:tc>
+        <w:tc>
+          <w:tcPr>
+            <w:tcW w:type="dxa" w:w="6560"/>
+            <w:shd w:fill="FAFBFC"/>
+            <w:vAlign w:val="center"/>
+            <w:tcMar>
+              <w:top w:w="80" w:type="dxa"/>
+              <w:bottom w:w="80" w:type="dxa"/>
+              <w:start w:w="120" w:type="dxa"/>
+              <w:end w:w="120" w:type="dxa"/>
+            </w:tcMar>
+          </w:tcPr>
+          <w:p>
+            <w:r>
+              <w:t>pull-from-github.bat</w:t>
             </w:r>
           </w:p>
         </w:tc>

</xml_diff>

<commit_message>
feat: add state-grade defensive hardening
</commit_message>
<xml_diff>
--- a/Angerona_Master_Manual.docx
+++ b/Angerona_Master_Manual.docx
@@ -110,7 +110,7 @@
           </w:tcPr>
           <w:p>
             <w:r>
-              <w:t>Current release: v1.10.3 - governed autonomous Adversary Combat, receipt-bound SOAR, typed ARIA authority, authenticated App Control decision evidence, exhaustive UI contracts, and a frozen zero-failure gate.</w:t>
+              <w:t>Current release: v1.10.3 - state-grade defensive hardening for SSH, audit-log continuity, untrusted physical network paths, Personal Sentinel path attestation, sanitized live activity, and governed ARIA Defense Memory; the final gate remains zero-failure.</w:t>
             </w:r>
           </w:p>
         </w:tc>
@@ -134,7 +134,7 @@
           <w:color w:val="0B2545"/>
           <w:sz w:val="22"/>
         </w:rPr>
-        <w:t>25 August 2026</w:t>
+        <w:t>26 August 2026</w:t>
       </w:r>
     </w:p>
     <w:p>
@@ -337,7 +337,7 @@
                 <w:color w:val="243447"/>
                 <w:sz w:val="18"/>
               </w:rPr>
-              <w:t>Frozen local release candidate; automated and live defensive validation complete</w:t>
+              <w:t>Current local release candidate; three-round Cycle 23 defensive hardening and full serial validation complete</w:t>
             </w:r>
           </w:p>
         </w:tc>
@@ -495,7 +495,7 @@
                 <w:color w:val="243447"/>
                 <w:sz w:val="18"/>
               </w:rPr>
-              <w:t>Current repository code and analysis/loop evidence as of 25 August 2026</w:t>
+              <w:t>Current repository code and analysis/loop/cycle23 evidence as of 26 August 2026</w:t>
             </w:r>
           </w:p>
         </w:tc>
@@ -633,6 +633,7 @@
     <w:p>
       <w:pPr>
         <w:pStyle w:val="Heading1"/>
+        <w:pageBreakBefore/>
       </w:pPr>
       <w:r>
         <w:t>Contents</w:t>
@@ -968,7 +969,7 @@
           <w:i w:val="0"/>
           <w:color w:val="243447"/>
         </w:rPr>
-        <w:t>Angerona unifies Windows endpoint and network visibility, local evidence retention, case work, MITRE ATT&amp;CK mapping, governed containment, recovery, local AI assistance, and non-destructive purple-team validation. Its 68 discovered modules share a typed EventBus and explicit platform contracts.</w:t>
+        <w:t>Angerona unifies Windows endpoint and network visibility, local evidence retention, case work, MITRE ATT&amp;CK mapping, governed containment, recovery, local AI assistance, and non-destructive purple-team validation. Its 71 discovered modules share a typed EventBus and explicit platform contracts.</w:t>
       </w:r>
     </w:p>
     <w:tbl>
@@ -2990,6 +2991,66 @@
           <w:sz w:val="19"/>
         </w:rPr>
         <w:t>src/angerona/shark - Shark Attack, Red Team simulation, and After-Action Reports.</w:t>
+      </w:r>
+    </w:p>
+    <w:p>
+      <w:pPr>
+        <w:pStyle w:val="Heading2"/>
+      </w:pPr>
+      <w:r>
+        <w:t>3.2 State-grade defense-in-depth and network trust flow</w:t>
+      </w:r>
+    </w:p>
+    <w:p>
+      <w:pPr/>
+      <w:r>
+        <w:t>Cycle 23 adds actor-neutral, observe-only controls around remote access, telemetry continuity, and hostile network paths. Observation, evidence, decision, authorization, mutation, and verification remain separate trust stages; no new detector can authorize a response by itself.</w:t>
+      </w:r>
+    </w:p>
+    <w:p>
+      <w:pPr>
+        <w:pStyle w:val="CodeBlock"/>
+      </w:pPr>
+      <w:r>
+        <w:t>Angerona host</w:t>
+        <w:br/>
+        <w:t xml:space="preserve">  -&gt; operator-controlled Personal Sentinel gateway/firewall</w:t>
+        <w:br/>
+        <w:t xml:space="preserve">  -&gt; upstream or ISP router</w:t>
+        <w:br/>
+        <w:t xml:space="preserve">  -&gt; Internet</w:t>
+      </w:r>
+    </w:p>
+    <w:p>
+      <w:pPr>
+        <w:pStyle w:val="ListBullet"/>
+      </w:pPr>
+      <w:r>
+        <w:t>Every active non-loopback physical Wi-Fi or Ethernet path starts untrusted. Private addressing, an operating-system network category, and a familiar wireless name are context, not identity.</w:t>
+      </w:r>
+    </w:p>
+    <w:p>
+      <w:pPr>
+        <w:pStyle w:val="ListBullet"/>
+      </w:pPr>
+      <w:r>
+        <w:t>The Personal Sentinel component is a vendor-neutral HTTPS attestation client for one explicitly enrolled default-gateway path. It requires normal certificate validation plus a certificate pin, a fresh nonce, a pinned policy digest, direct proxy-free transport, no redirect, and stable route context before and after the exchange.</w:t>
+      </w:r>
+    </w:p>
+    <w:p>
+      <w:pPr>
+        <w:pStyle w:val="ListBullet"/>
+      </w:pPr>
+      <w:r>
+        <w:t>A verified gateway labels only that exact path as gateway-attested. It never trusts applications, users, destination resources, firmware, the upstream router, or the Internet, and it grants no response authority.</w:t>
+      </w:r>
+    </w:p>
+    <w:p>
+      <w:pPr>
+        <w:pStyle w:val="ListBullet"/>
+      </w:pPr>
+      <w:r>
+        <w:t>The client does not discover, configure, credential, or operate a router. The actual intermediate appliance/server, routing policy, firmware measurement, and separate monotonic witness remain deployment projects.</w:t>
       </w:r>
     </w:p>
     <w:p>
@@ -4747,6 +4808,26 @@
     </w:p>
     <w:p>
       <w:pPr>
+        <w:pStyle w:val="Heading2"/>
+      </w:pPr>
+      <w:r>
+        <w:t>5.2 Live Defense Activity</w:t>
+      </w:r>
+    </w:p>
+    <w:p>
+      <w:pPr/>
+      <w:r>
+        <w:t>The dashboard now includes a bounded Live Defense Activity card for observable operational activity. It requests at most 16 recent public events, displays at most five sanitized rows, and refreshes through the existing dashboard cadence. It reads timestamp, severity, module, and public message only; Event.details, local identifiers, credentials, source code, and private model reasoning are outside the card's boundary.</w:t>
+      </w:r>
+    </w:p>
+    <w:p>
+      <w:pPr/>
+      <w:r>
+        <w:t>Use this surface to confirm coarse module and EventBus activity, then open Live Alerts, Forensics, or Local SOC for evidence. It is not a debugger, code tracer, evidence viewer, live-code display, or chain-of-thought window.</w:t>
+      </w:r>
+    </w:p>
+    <w:p>
+      <w:pPr>
         <w:pStyle w:val="Heading1"/>
         <w:pageBreakBefore/>
       </w:pPr>
@@ -5404,6 +5485,96 @@
           <w:color w:val="243447"/>
         </w:rPr>
         <w:t>Guarded osquery integration uses fixed read-only snapshots; callers cannot supply arbitrary SQL, extensions, targets, or installers. Imported evidence cannot authorize a host action merely because it contains response-looking fields.</w:t>
+      </w:r>
+    </w:p>
+    <w:p>
+      <w:pPr>
+        <w:pStyle w:val="Heading2"/>
+      </w:pPr>
+      <w:r>
+        <w:t>6.4 SSH Surface / Key / Tunnel Guard</w:t>
+      </w:r>
+    </w:p>
+    <w:p>
+      <w:pPr/>
+      <w:r>
+        <w:t>The cross-platform SSH guard performs bounded read-only inspection of canonical OpenSSH configuration and Include graphs, Match ambiguity, effective authentication and forwarding posture, configured per-user key sources, file and parent-directory custody, public-key fingerprints and restrictions, host-key digests, services, listeners, client forwarding options, connections, and supported authentication/tunnel evidence.</w:t>
+      </w:r>
+    </w:p>
+    <w:p>
+      <w:pPr>
+        <w:pStyle w:val="ListBullet"/>
+      </w:pPr>
+      <w:r>
+        <w:t>Windows OpenSSH evidence uses fixed Admin and Operational channels and fixed event identities, with bounded retry, source reopen, recovery-tail inspection, and an honest retained warning after blind intervals.</w:t>
+      </w:r>
+    </w:p>
+    <w:p>
+      <w:pPr>
+        <w:pStyle w:val="ListBullet"/>
+      </w:pPr>
+      <w:r>
+        <w:t>The guard tokenizes accounts, paths, processes, endpoints, and sources. It never reads private keys, captures credentials, probes a listener, attempts a login, removes a key, terminates a tunnel, rewrites policy, or auto-promotes its first baseline.</w:t>
+      </w:r>
+    </w:p>
+    <w:p>
+      <w:pPr>
+        <w:pStyle w:val="Heading2"/>
+      </w:pPr>
+      <w:r>
+        <w:t>6.5 Audit Log Integrity Guard</w:t>
+      </w:r>
+    </w:p>
+    <w:p>
+      <w:pPr/>
+      <w:r>
+        <w:t>The Windows Audit Log Integrity Guard watches fixed Security, System, and Sysmon clear, policy, service, capacity, and internal-error evidence. Authenticated channel generations, record anchors, cursors, bounded retained replay, and transition-stability checks expose explicit clearing, regression, refill, retention gaps, record reuse, source blindness, and checkpoint tamper without retaining raw event XML.</w:t>
+      </w:r>
+    </w:p>
+    <w:p>
+      <w:pPr>
+        <w:pStyle w:val="ListBullet"/>
+      </w:pPr>
+      <w:r>
+        <w:t>A gap establishes missing confidence; it cannot identify everything that happened during the missing interval or restore deleted records. An unreadable or unauthenticated checkpoint fails closed rather than creating a clean baseline.</w:t>
+      </w:r>
+    </w:p>
+    <w:p>
+      <w:pPr>
+        <w:pStyle w:val="ListBullet"/>
+      </w:pPr>
+      <w:r>
+        <w:t>Local HMAC custody detects alteration but cannot detect replay of an older matching state pair. The protocol for a separate high-water authority is built and tested, but no independently administered server or policy-bound hardware authority is configured by default; freshness therefore remains local-authenticity-only.</w:t>
+      </w:r>
+    </w:p>
+    <w:p>
+      <w:pPr>
+        <w:pStyle w:val="Heading2"/>
+      </w:pPr>
+      <w:r>
+        <w:t>6.6 Zero-Trust Network Path Monitor</w:t>
+      </w:r>
+    </w:p>
+    <w:p>
+      <w:pPr/>
+      <w:r>
+        <w:t>The network monitor tokenizes physical interface, wireless, DNS, DHCP, route, gateway-neighbor, profile, and connection-epoch evidence. It reports incomplete collection, concurrent/default-path anomalies, weak or unknown wireless protection, infrastructure drift, and explicit path addition while keeping every physical path untrusted by default.</w:t>
+      </w:r>
+    </w:p>
+    <w:p>
+      <w:pPr>
+        <w:pStyle w:val="ListBullet"/>
+      </w:pPr>
+      <w:r>
+        <w:t>A newly added path is persisted only as a provisional authenticated transition. Promotion requires the exact pending path to remain active and unchanged; absence, concurrent drift, lost freshness, failed persistence, or bounded-history pressure freezes the prior authenticated comparison baseline.</w:t>
+      </w:r>
+    </w:p>
+    <w:p>
+      <w:pPr>
+        <w:pStyle w:val="ListBullet"/>
+      </w:pPr>
+      <w:r>
+        <w:t>The monitor is observe-only: it does not discover devices, change routes, operate a VPN, reconfigure profiles, change firewall policy, or trust endpoints reached through an attested gateway.</w:t>
       </w:r>
     </w:p>
     <w:p>
@@ -7254,6 +7425,26 @@
     </w:p>
     <w:p>
       <w:pPr>
+        <w:pStyle w:val="Heading2"/>
+      </w:pPr>
+      <w:r>
+        <w:t>9.4 Governed ARIA Defense Memory</w:t>
+      </w:r>
+    </w:p>
+    <w:p>
+      <w:pPr/>
+      <w:r>
+        <w:t>ARIA now indexes a built-in defensive reference with 10 entries covering Angerona capabilities and workflow, zero trust, SSH, erased-log response, hostile network paths, Personal Sentinel, live activity, evidence-led response, actor-neutral advanced tradecraft mappings, and assurance limits. The JSON asset is read-only, strict-schema, duplicate-key rejecting, structurally bounded, stable-read checked, resource-root confined, and pinned to a canonical SHA-256 digest before retrieval.</w:t>
+      </w:r>
+    </w:p>
+    <w:p>
+      <w:pPr/>
+      <w:r>
+        <w:t>Local retrieval may use the complete bounded synthesized reference. Optional cloud fallback can receive only selected redacted excerpts whose exact source is angerona://defense-memory; live telemetry and arbitrary operator runbooks remain local. The memory is static advisory data, not a self-writing learning store, executable playbook, prompt override, or action authority.</w:t>
+      </w:r>
+    </w:p>
+    <w:p>
+      <w:pPr>
         <w:pStyle w:val="Heading1"/>
         <w:pageBreakBefore/>
       </w:pPr>
@@ -7829,7 +8020,7 @@
           </w:tcPr>
           <w:p>
             <w:r>
-              <w:t>1,308 collected across 201 files; 1,305 passed; 3 intentional skips; 0 failed</w:t>
+              <w:t>1,465 collected across 208 files; 1,460 passed; 5 expected host-capability skips; 0 failed</w:t>
             </w:r>
           </w:p>
         </w:tc>
@@ -7875,7 +8066,7 @@
           </w:tcPr>
           <w:p>
             <w:r>
-              <w:t>310/310 product Python files</w:t>
+              <w:t>321/321 product Python files</w:t>
             </w:r>
           </w:p>
         </w:tc>
@@ -7927,7 +8118,7 @@
                 <w:color w:val="243447"/>
                 <w:sz w:val="17"/>
               </w:rPr>
-              <w:t>Ruff, imports, discovery, duplicate name/code, and patch-integrity gates passed</w:t>
+              <w:t>Ruff, 73 module-file imports, 71/71 discovery, 58/58 register hooks, duplicate name/code, and patch-integrity gates passed</w:t>
             </w:r>
           </w:p>
         </w:tc>
@@ -7973,7 +8164,7 @@
           </w:tcPr>
           <w:p>
             <w:r>
-              <w:t>48 genuine pass; 0 genuine fail; 13 expected inactive; 8 platform/operator skips</w:t>
+              <w:t>50 genuine pass; 0 genuine fail; 21 explicit inactive/platform skips; EventBus pipeline passed</w:t>
             </w:r>
           </w:p>
         </w:tc>
@@ -8025,7 +8216,7 @@
                 <w:color w:val="243447"/>
                 <w:sz w:val="17"/>
               </w:rPr>
-              <w:t>20/20 passed</w:t>
+              <w:t>22/22 passed</w:t>
             </w:r>
           </w:p>
         </w:tc>
@@ -8499,7 +8690,51 @@
           <w:i w:val="0"/>
           <w:color w:val="243447"/>
         </w:rPr>
-        <w:t>The three skipped pytest cases are intentional platform gates. Expected inactive module results identify stopped sensors, idle/unarmed SOAR or Combat, and unavailable optional Ollama; they are not hidden failures.</w:t>
+        <w:t>The five skipped pytest cases are expected host-capability gates. Expected inactive module results identify stopped sensors, idle or unarmed SOAR or Combat, unavailable optional Ollama, and unsupported platform features; they are not hidden failures.</w:t>
+      </w:r>
+    </w:p>
+    <w:p>
+      <w:pPr>
+        <w:pStyle w:val="Heading2"/>
+      </w:pPr>
+      <w:r>
+        <w:t>13.2 Cycle 23 final validation</w:t>
+      </w:r>
+    </w:p>
+    <w:p>
+      <w:pPr/>
+      <w:r>
+        <w:t>Three sequential defensive review rounds closed 15 findings: Round 1 fixed nine; Round 2 fixed five and retained one independently administered high-water authority as deferred; Round 3 found and fixed one physical-path restart-continuity defect. The final actor-neutral review reproduced no remaining Cycle 23 Critical or High issue and did not re-label the external dependency as shipped.</w:t>
+      </w:r>
+    </w:p>
+    <w:p>
+      <w:pPr>
+        <w:pStyle w:val="ListBullet"/>
+      </w:pPr>
+      <w:r>
+        <w:t>The authoritative one-process suite collected 1,465 tests across 208 files: 1,460 passed, five expected host-capability skips, and zero failed.</w:t>
+      </w:r>
+    </w:p>
+    <w:p>
+      <w:pPr>
+        <w:pStyle w:val="ListBullet"/>
+      </w:pPr>
+      <w:r>
+        <w:t>All 321 product Python files compiled. Ruff passed; 73 module files imported; 71 of 71 modules discovered; all 58 compatibility register hooks were valid; core and Shark self-tests passed 22 of 22.</w:t>
+      </w:r>
+    </w:p>
+    <w:p>
+      <w:pPr>
+        <w:pStyle w:val="ListBullet"/>
+      </w:pPr>
+      <w:r>
+        <w:t>The module harness produced 50 passes, zero failures, and 21 explicit inactive/platform skips plus a passing EventBus pipeline. Direct and batch selfcheck both passed 26 of 26.</w:t>
+      </w:r>
+    </w:p>
+    <w:p>
+      <w:pPr/>
+      <w:r>
+        <w:t>These gates are strong project evidence, not independent certification, state-actor attribution, or proof of complete attack coverage.</w:t>
       </w:r>
     </w:p>
     <w:p>
@@ -9153,6 +9388,26 @@
     </w:p>
     <w:p>
       <w:pPr>
+        <w:pStyle w:val="Heading2"/>
+      </w:pPr>
+      <w:r>
+        <w:t>14.2 Cycle 23 measured hot-path decisions</w:t>
+      </w:r>
+    </w:p>
+    <w:p>
+      <w:pPr/>
+      <w:r>
+        <w:t>Round 1 avoided redundant unchanged audit-state writes (97.6% in the measured case), limited SSH command-line work to admitted clients (90.9%), and skipped rebuilding an already-untrusted immutable network snapshot (93.3%). Round 2 replaced quadratic per-user SSH token expansion with one bounded pass, improving token-heavy stress cases by 98.8% to 99.4%.</w:t>
+      </w:r>
+    </w:p>
+    <w:p>
+      <w:pPr/>
+      <w:r>
+        <w:t>Round 3 retained direct pending-path security logic after maximum-bound evaluation measured 2.817 to 3.113 ms and proposed alternatives were either negligible at the 64-path cap or slower in normal/stress cases. Security clarity, freshness checks, anchors, retries, and pre/post route observations were not traded for benchmark numbers.</w:t>
+      </w:r>
+    </w:p>
+    <w:p>
+      <w:pPr>
         <w:pStyle w:val="Heading1"/>
         <w:pageBreakBefore/>
       </w:pPr>
@@ -9332,6 +9587,46 @@
     <w:p>
       <w:r>
         <w:t>The ranked next work is a digest-pinned ATT&amp;CK v19.2 registry, a protected PowerShell Operational/4104 sensor, an EPSS v5 + KEV + SSVC host-risk queue, event-driven Task Scheduler/BITS persistence evidence, and an App Control policy-inventory lifecycle. These are proposals, not current product claims.</w:t>
+      </w:r>
+    </w:p>
+    <w:p>
+      <w:pPr>
+        <w:pStyle w:val="Heading2"/>
+      </w:pPr>
+      <w:r>
+        <w:t>15.4 Cycle 23 assurance boundary</w:t>
+      </w:r>
+    </w:p>
+    <w:p>
+      <w:pPr>
+        <w:pStyle w:val="ListBullet"/>
+      </w:pPr>
+      <w:r>
+        <w:t>Built now: observe-only SSH posture/runtime drift, fixed-source Windows audit-clear and continuity evidence, zero-trust physical-path drift, a pinned Personal Sentinel attestation client, sanitized dashboard activity, and pinned governed ARIA defensive reference memory.</w:t>
+      </w:r>
+    </w:p>
+    <w:p>
+      <w:pPr>
+        <w:pStyle w:val="ListBullet"/>
+      </w:pPr>
+      <w:r>
+        <w:t>Built as contracts but not a deployed independent service: compact witness receipt verification and the IndependentHighWater interface with rollback, fork, clone, outage, migration, and crash tests.</w:t>
+      </w:r>
+    </w:p>
+    <w:p>
+      <w:pPr>
+        <w:pStyle w:val="ListBullet"/>
+      </w:pPr>
+      <w:r>
+        <w:t>Proposed or deferred: the actual gateway/firewall appliance and routing role, a separately administered monotonic witness server or policy-bound hardware authority, firmware/signed-boot measurement, resource-scoped egress leases, and authoritative SSH key-to-session provenance.</w:t>
+      </w:r>
+    </w:p>
+    <w:p>
+      <w:pPr>
+        <w:pStyle w:val="ListBullet"/>
+      </w:pPr>
+      <w:r>
+        <w:t>A compromised Administrator or SYSTEM principal, kernel, hypervisor, firmware, upstream provider, stolen identity, or separately administered witness can still defeat or deny user-mode evidence. Zero trust limits implicit authority; it does not make any layer infallible.</w:t>
       </w:r>
     </w:p>
     <w:p>
@@ -11133,6 +11428,50 @@
     </w:p>
     <w:p>
       <w:pPr>
+        <w:pStyle w:val="Heading2"/>
+      </w:pPr>
+      <w:r>
+        <w:t>17.5 v1.10.3 state-grade defensive hardening (2026-08-26)</w:t>
+      </w:r>
+    </w:p>
+    <w:p>
+      <w:pPr/>
+      <w:r>
+        <w:t>Cycle 23 translates public advanced-operator tradecraft into actor-neutral defensive controls instead of an attribution engine. It adds SSH posture/key/tunnel observation, Windows audit-log clear and continuity evidence, hostile-by-default physical network evaluation, exact-path Personal Sentinel attestation, sanitized live defense activity, and governed ARIA Defense Memory.</w:t>
+      </w:r>
+    </w:p>
+    <w:p>
+      <w:pPr>
+        <w:pStyle w:val="ListBullet"/>
+      </w:pPr>
+      <w:r>
+        <w:t>Fifteen findings were fixed across three review rounds. The final Round 3 path-addition repair authenticates pending membership and requires active unchanged confirmation across restart before promotion.</w:t>
+      </w:r>
+    </w:p>
+    <w:p>
+      <w:pPr>
+        <w:pStyle w:val="ListBullet"/>
+      </w:pPr>
+      <w:r>
+        <w:t>Final automated evidence: 1,460 passed, five expected skips, zero failed from 1,465 tests across 208 files; 321 of 321 product files compiled; 71 of 71 modules discovered; Ruff and both 26 of 26 selfchecks passed.</w:t>
+      </w:r>
+    </w:p>
+    <w:p>
+      <w:pPr>
+        <w:pStyle w:val="ListBullet"/>
+      </w:pPr>
+      <w:r>
+        <w:t>Measured applied wins range from 90.9% to 99.4% in their declared bounded cases. Round 3 intentionally retained clearer direct security transitions when alternatives were negligible or slower.</w:t>
+      </w:r>
+    </w:p>
+    <w:p>
+      <w:pPr/>
+      <w:r>
+        <w:t>The separately administered monotonic authority remains deferred. Without it, authenticated local state is explicitly local-authenticity-only and not independently fresh. The Personal Sentinel client attests one path; it is not an appliance, router manager, firmware verifier, endpoint trust grant, or response authority.</w:t>
+      </w:r>
+    </w:p>
+    <w:p>
+      <w:pPr>
         <w:pStyle w:val="Heading1"/>
         <w:pageBreakBefore/>
       </w:pPr>
@@ -11848,7 +12187,7 @@
           <w:i w:val="0"/>
           <w:color w:val="243447"/>
         </w:rPr>
-        <w:t>Repository evidence: analysis/loop/LOOP_LOG.md; innovation_ideas.md; round1-round7 findings, remediation, bug-test, and performance summaries; cycle7/round3 validation; final Combat validation artifacts; and the frozen source/tests.</w:t>
+        <w:t>Repository evidence: analysis/loop/LOOP_LOG.md; analysis/loop/cycle23 research and round1-round3 findings, remediation, bug-test, performance, and visionary summaries; final Combat validation artifacts; and the current source/tests.</w:t>
       </w:r>
     </w:p>
     <w:p>
@@ -12013,7 +12352,76 @@
     </w:p>
     <w:p>
       <w:pPr>
+        <w:pStyle w:val="Heading2"/>
+      </w:pPr>
+      <w:r>
+        <w:t>B.1 Cycle 23 primary defensive sources</w:t>
+      </w:r>
+    </w:p>
+    <w:p>
+      <w:pPr/>
+      <w:r>
+        <w:t>CISA AA25-239A, network-device and SSH persistence: https://www.cisa.gov/news-events/cybersecurity-advisories/aa25-239a</w:t>
+      </w:r>
+    </w:p>
+    <w:p>
+      <w:pPr/>
+      <w:r>
+        <w:t>CISA AA24-038A, critical-infrastructure persistence and telemetry guidance: https://www.cisa.gov/sites/default/files/2024-03/aa24-038a_csa_prc_state_sponsored_actors_compromise_us_critical_infrastructure_3.pdf</w:t>
+      </w:r>
+    </w:p>
+    <w:p>
+      <w:pPr/>
+      <w:r>
+        <w:t>FBI/NSA 2026 router and DNS/DHCP risk advisory: https://www.ic3.gov/PSA/2026/PSA260407</w:t>
+      </w:r>
+    </w:p>
+    <w:p>
+      <w:pPr/>
+      <w:r>
+        <w:t>NSA Improve Router Hygiene: https://media.defense.gov/2026/Jul/09/2003959498/-1/-1/0/CSA_IMPROVE_ROUTER_HYGIENE.PDF</w:t>
+      </w:r>
+    </w:p>
+    <w:p>
+      <w:pPr/>
+      <w:r>
+        <w:t>NIST SP 800-207, Zero Trust Architecture: https://csrc.nist.gov/pubs/sp/800/207/final</w:t>
+      </w:r>
+    </w:p>
+    <w:p>
+      <w:pPr/>
+      <w:r>
+        <w:t>Microsoft OpenSSH Server configuration: https://learn.microsoft.com/en-us/windows-server/administration/openssh/openssh-server-configuration</w:t>
+      </w:r>
+    </w:p>
+    <w:p>
+      <w:pPr/>
+      <w:r>
+        <w:t>Microsoft OpenSSH verbose logging: https://learn.microsoft.com/en-us/troubleshoot/windows-server/system-management-components/enable-openssh-verbose-logging</w:t>
+      </w:r>
+    </w:p>
+    <w:p>
+      <w:pPr/>
+      <w:r>
+        <w:t>MITRE ATT&amp;CK T1070.001, Clear Windows Event Logs: https://attack.mitre.org/techniques/T1070/001/</w:t>
+      </w:r>
+    </w:p>
+    <w:p>
+      <w:pPr/>
+      <w:r>
+        <w:t>Microsoft BadPilot campaign analysis: https://www.microsoft.com/en-us/security/blog/2025/02/12/the-badpilot-campaign-seashell-blizzard-subgroup-conducts-multiyear-global-access-operation/</w:t>
+      </w:r>
+    </w:p>
+    <w:p>
+      <w:pPr/>
+      <w:r>
+        <w:t>These sources describe observable techniques and defensive priorities. A matching behavior is not proof of any agency, government, campaign, or operator.</w:t>
+      </w:r>
+    </w:p>
+    <w:p>
+      <w:pPr>
         <w:pStyle w:val="Heading1"/>
+        <w:pageBreakBefore/>
       </w:pPr>
       <w:r>
         <w:t>Appendix C. Glossary</w:t>
@@ -12641,7 +13049,7 @@
         <w:color w:val="667085"/>
         <w:sz w:val="17"/>
       </w:rPr>
-      <w:t>Angerona Suite  |  v1.10.3  |  25 August 2026</w:t>
+      <w:t>Angerona Suite  |  v1.10.3  |  26 August 2026</w:t>
     </w:r>
   </w:p>
 </w:ftr>

</xml_diff>

<commit_message>
feat: harden independent trust and release boundaries
</commit_message>
<xml_diff>
--- a/Angerona_Master_Manual.docx
+++ b/Angerona_Master_Manual.docx
@@ -110,7 +110,7 @@
           </w:tcPr>
           <w:p>
             <w:r>
-              <w:t>Current release: v1.10.3 - state-grade defensive hardening for SSH, audit-log continuity, untrusted physical network paths, Personal Sentinel path attestation, sanitized live activity, and governed ARIA Defense Memory; the final gate remains zero-failure.</w:t>
+              <w:t>Current release: v1.11.0 - independent-trust hardening for authenticated telemetry continuity, hostile network paths, operator-gated response, governed AI memory, recovery assurance, and signed release boundaries.</w:t>
             </w:r>
           </w:p>
         </w:tc>
@@ -134,7 +134,7 @@
           <w:color w:val="0B2545"/>
           <w:sz w:val="22"/>
         </w:rPr>
-        <w:t>26 August 2026</w:t>
+        <w:t>27 August 2026</w:t>
       </w:r>
     </w:p>
     <w:p>
@@ -283,7 +283,7 @@
           </w:tcPr>
           <w:p>
             <w:r>
-              <w:t>1.10.3</w:t>
+              <w:t>1.11.0</w:t>
             </w:r>
           </w:p>
         </w:tc>
@@ -337,7 +337,7 @@
                 <w:color w:val="243447"/>
                 <w:sz w:val="18"/>
               </w:rPr>
-              <w:t>Current local release candidate; three-round Cycle 23 defensive hardening and full serial validation complete</w:t>
+              <w:t>Cycle 24 defensive hardening and final serial validation complete; signed deployment artifacts remain externally governed outputs</w:t>
             </w:r>
           </w:p>
         </w:tc>
@@ -495,7 +495,7 @@
                 <w:color w:val="243447"/>
                 <w:sz w:val="18"/>
               </w:rPr>
-              <w:t>Current repository code and analysis/loop/cycle23 evidence as of 26 August 2026</w:t>
+              <w:t>Current repository code and analysis/loop/cycle24 evidence as of 27 August 2026</w:t>
             </w:r>
           </w:p>
         </w:tc>
@@ -969,7 +969,7 @@
           <w:i w:val="0"/>
           <w:color w:val="243447"/>
         </w:rPr>
-        <w:t>Angerona unifies Windows endpoint and network visibility, local evidence retention, case work, MITRE ATT&amp;CK mapping, governed containment, recovery, local AI assistance, and non-destructive purple-team validation. Its 71 discovered modules share a typed EventBus and explicit platform contracts.</w:t>
+        <w:t>Angerona unifies Windows endpoint and network visibility, local evidence retention, case work, MITRE ATT&amp;CK mapping, governed containment, recovery, local AI assistance, and non-destructive purple-team validation. Its current discovery contract covers 80 Windows, 14 Linux, and 13 macOS defensive modules sharing a typed EventBus and explicit platform contracts.</w:t>
       </w:r>
     </w:p>
     <w:tbl>
@@ -3082,7 +3082,7 @@
           <w:rFonts w:ascii="Calibri" w:hAnsi="Calibri" w:eastAsia="Calibri"/>
           <w:color w:val="243447"/>
         </w:rPr>
-        <w:t>Download the Setup executable and its adjacent SHA-256 file from the GitHub Releases page.</w:t>
+        <w:t>Download the signed x64 full-trust MSIX and its exact SHA-256 and provenance records from the tagged release.</w:t>
       </w:r>
     </w:p>
     <w:p>
@@ -3097,7 +3097,7 @@
           <w:rFonts w:ascii="Calibri" w:hAnsi="Calibri" w:eastAsia="Calibri"/>
           <w:color w:val="243447"/>
         </w:rPr>
-        <w:t>Verify the digest and GitHub build attestation. The current publication path is not backed by an Authenticode publisher certificate, so Windows may show Unknown Publisher.</w:t>
+        <w:t>Confirm the exact digest and expected Windows package publisher; refuse unsigned, unexpected-publisher, or unprovisioned builds.</w:t>
       </w:r>
     </w:p>
     <w:p>
@@ -3112,7 +3112,7 @@
           <w:rFonts w:ascii="Calibri" w:hAnsi="Calibri" w:eastAsia="Calibri"/>
           <w:color w:val="243447"/>
         </w:rPr>
-        <w:t>Run Setup, approve UAC, and complete Full Setup. The protected data root prefers D:\AngeronaData and uses protected %ProgramData%\Angerona only when D: is unavailable.</w:t>
+        <w:t>Install through the Windows package UI. Classic Setup is non-public and prior-install migration-only; ZIPs are verifier-gated upgrades, never first-install paths.</w:t>
       </w:r>
     </w:p>
     <w:p>
@@ -7434,13 +7434,13 @@
     <w:p>
       <w:pPr/>
       <w:r>
-        <w:t>ARIA now indexes a built-in defensive reference with 10 entries covering Angerona capabilities and workflow, zero trust, SSH, erased-log response, hostile network paths, Personal Sentinel, live activity, evidence-led response, actor-neutral advanced tradecraft mappings, and assurance limits. The JSON asset is read-only, strict-schema, duplicate-key rejecting, structurally bounded, stable-read checked, resource-root confined, and pinned to a canonical SHA-256 digest before retrieval.</w:t>
+        <w:t>ARIA now indexes a built-in defensive reference with 18 entries covering Angerona capabilities and workflow, zero trust, SSH, erased-log response, hostile network paths, Personal Sentinel, live activity, evidence-led response, actor-neutral advanced tradecraft mappings, and assurance limits. The JSON asset is read-only, strict-schema, duplicate-key rejecting, structurally bounded, stable-read checked, resource-root confined, and pinned to a canonical SHA-256 digest before retrieval.</w:t>
       </w:r>
     </w:p>
     <w:p>
       <w:pPr/>
       <w:r>
-        <w:t>Local retrieval may use the complete bounded synthesized reference. Optional cloud fallback can receive only selected redacted excerpts whose exact source is angerona://defense-memory; live telemetry and arbitrary operator runbooks remain local. The memory is static advisory data, not a self-writing learning store, executable playbook, prompt override, or action authority.</w:t>
+        <w:t>Local retrieval may use the complete bounded synthesized reference. Optional cloud fallback can receive at most one ranked canonical redacted excerpt whose exact source is angerona://defense-memory; live telemetry and arbitrary operator runbooks remain local. The memory is static advisory data, not a self-writing learning store, executable playbook, prompt override, or action authority.</w:t>
       </w:r>
     </w:p>
     <w:p>
@@ -8020,7 +8020,7 @@
           </w:tcPr>
           <w:p>
             <w:r>
-              <w:t>1,465 collected across 208 files; 1,460 passed; 5 expected host-capability skips; 0 failed</w:t>
+              <w:t>1,675 collected across 229 files; 1,670 passed; 5 expected host-capability skips; 0 failed</w:t>
             </w:r>
           </w:p>
         </w:tc>
@@ -8066,7 +8066,7 @@
           </w:tcPr>
           <w:p>
             <w:r>
-              <w:t>321/321 product Python files</w:t>
+              <w:t>611/611 Python files; 345/345 product files</w:t>
             </w:r>
           </w:p>
         </w:tc>
@@ -8118,7 +8118,7 @@
                 <w:color w:val="243447"/>
                 <w:sz w:val="17"/>
               </w:rPr>
-              <w:t>Ruff, 73 module-file imports, 71/71 discovery, 58/58 register hooks, duplicate name/code, and patch-integrity gates passed</w:t>
+              <w:t>Ruff; 80 Windows / 14 Linux / 13 macOS discovery; zero discovery errors; documentation-drift and patch-integrity gates passed</w:t>
             </w:r>
           </w:p>
         </w:tc>
@@ -8164,7 +8164,7 @@
           </w:tcPr>
           <w:p>
             <w:r>
-              <w:t>50 genuine pass; 0 genuine fail; 21 explicit inactive/platform skips; EventBus pipeline passed</w:t>
+              <w:t>60 genuine pass; 0 genuine fail; 21 expected inactive/platform skips; EventBus pipeline passed</w:t>
             </w:r>
           </w:p>
         </w:tc>
@@ -8322,7 +8322,7 @@
                 <w:color w:val="243447"/>
                 <w:sz w:val="17"/>
               </w:rPr>
-              <w:t>26/26 direct and 26/26 batch</w:t>
+              <w:t>26/26 passed</w:t>
             </w:r>
           </w:p>
         </w:tc>
@@ -9449,7 +9449,7 @@
           </w:tcPr>
           <w:p>
             <w:r>
-              <w:t>Final red-team verdict: No open Critical, High, or Medium release blocker remains in the frozen v1.10.3 deterministic tree. Physical WEVT lifecycle soak and the external gates below remain outstanding acceptance work.</w:t>
+              <w:t>Final red-team verdict: No open Critical, High, or Medium Cycle 24 code blocker remains in the current v1.11.0 tree. Publisher/root custody, clean-machine package validation, hardware rollback resistance, and the external gates below remain outstanding acceptance work.</w:t>
             </w:r>
           </w:p>
         </w:tc>
@@ -11472,6 +11472,75 @@
     </w:p>
     <w:p>
       <w:pPr>
+        <w:pStyle w:val="Heading2"/>
+        <w:keepNext/>
+      </w:pPr>
+      <w:r>
+        <w:t>17.6 v1.11.0 independent-trust hardening (2026-08-27)</w:t>
+      </w:r>
+    </w:p>
+    <w:p>
+      <w:pPr/>
+      <w:r>
+        <w:t>Cycle 24 adds independent-trust and continuity controls while preserving Angerona's observe, review, approve, execute, and verify boundaries. It does not add credential theft, intrusion, log deletion, attribution claims, or autonomous destructive remediation.</w:t>
+      </w:r>
+    </w:p>
+    <w:p>
+      <w:pPr>
+        <w:pStyle w:val="ListBullet"/>
+      </w:pPr>
+      <w:r>
+        <w:t>Authenticated producer identity, schema admission, sequence/loss accounting, SSH provenance, audit-log continuity, and recovery evidence expose gaps without claiming to reconstruct erased records.</w:t>
+      </w:r>
+    </w:p>
+    <w:p>
+      <w:pPr>
+        <w:pStyle w:val="ListBullet"/>
+      </w:pPr>
+      <w:r>
+        <w:t>Wi-Fi and Ethernet remain hostile-by-default. The Personal Sentinel reference authority attests an explicitly enrolled intermediate gateway path; it does not configure routers or grant endpoint, application, user, or response trust.</w:t>
+      </w:r>
+    </w:p>
+    <w:p>
+      <w:pPr>
+        <w:pStyle w:val="ListBullet"/>
+      </w:pPr>
+      <w:r>
+        <w:t>New defensive coverage includes identity/session and temporal correlation, measured boot, peripheral/DMA and driver provenance, process-bound egress, RAG provenance, trusted time, recovery assurance, update authority, and release transparency.</w:t>
+      </w:r>
+    </w:p>
+    <w:p>
+      <w:pPr>
+        <w:pStyle w:val="ListBullet"/>
+      </w:pPr>
+      <w:r>
+        <w:t>The dashboard's Live Defense Activity card shows only bounded, sanitized public EventBus records - never source code, secrets, private model reasoning, or chain of thought. ARIA Defense Memory v1.1.0 contains 18 pinned defensive references; an optional cloud fallback receives at most one ranked canonical redacted excerpt.</w:t>
+      </w:r>
+    </w:p>
+    <w:p>
+      <w:pPr>
+        <w:pStyle w:val="ListBullet"/>
+      </w:pPr>
+      <w:r>
+        <w:t>Public first installation is the signed x64 full-trust MSIX. The classic migration wrapper is non-public and prior-install-only; portable ZIPs are upgrade-only and require an installed verifier. Signing identity, protected keys, pinned compiler images, and enterprise distribution remain external deployment controls.</w:t>
+      </w:r>
+    </w:p>
+    <w:p>
+      <w:pPr>
+        <w:pStyle w:val="ListBullet"/>
+      </w:pPr>
+      <w:r>
+        <w:t>Final automated evidence: 1,675 collected across 229 test files; 1,670 passed, five expected host-capability skips, and zero failed. All 611 Python files compiled; Ruff, 26 application selfchecks, the 60-pass module harness, and discovery for 80 Windows, 14 Linux, and 13 macOS modules passed with zero discovery errors.</w:t>
+      </w:r>
+    </w:p>
+    <w:p>
+      <w:pPr/>
+      <w:r>
+        <w:t>These results are project evidence, not independent certification or proof against every administrator, kernel, firmware, hypervisor, supply-chain, identity, physical-access, or whole-host rollback attack.</w:t>
+      </w:r>
+    </w:p>
+    <w:p>
+      <w:pPr>
         <w:pStyle w:val="Heading1"/>
         <w:pageBreakBefore/>
       </w:pPr>
@@ -12187,7 +12256,7 @@
           <w:i w:val="0"/>
           <w:color w:val="243447"/>
         </w:rPr>
-        <w:t>Repository evidence: analysis/loop/LOOP_LOG.md; analysis/loop/cycle23 research and round1-round3 findings, remediation, bug-test, performance, and visionary summaries; final Combat validation artifacts; and the current source/tests.</w:t>
+        <w:t>Repository evidence: analysis/loop/LOOP_LOG.md; analysis/loop/cycle23 and cycle24 research and round1-round3 findings, remediation, bug-test, performance, and visionary summaries; final Combat validation artifacts; and the current source/tests.</w:t>
       </w:r>
     </w:p>
     <w:p>
@@ -12943,6 +13012,7 @@
       <w:footerReference w:type="default" r:id="rId10"/>
       <w:footerReference w:type="first" r:id="rId11"/>
       <w:headerReference w:type="first" r:id="rId12"/>
+      <w:headerReference w:type="even" r:id="rId13"/>
       <w:pgSz w:w="12240" w:h="15840"/>
       <w:pgMar w:top="1440" w:right="1440" w:bottom="1440" w:left="1440" w:header="708" w:footer="708" w:gutter="0"/>
       <w:cols w:space="720"/>
@@ -13049,7 +13119,7 @@
         <w:color w:val="667085"/>
         <w:sz w:val="17"/>
       </w:rPr>
-      <w:t>Angerona Suite  |  v1.10.3  |  26 August 2026</w:t>
+      <w:t>Angerona Suite  |  v1.11.0  |  27 August 2026</w:t>
     </w:r>
   </w:p>
 </w:ftr>
@@ -13069,13 +13139,23 @@
         <w:color w:val="667085"/>
         <w:sz w:val="17"/>
       </w:rPr>
-      <w:t>ANGERONA  |  MASTER MANUAL  |  v1.10.3</w:t>
+      <w:t>ANGERONA  |  MASTER MANUAL  |  v1.11.0</w:t>
     </w:r>
   </w:p>
 </w:hdr>
 </file>
 
 <file path=word/header2.xml><?xml version="1.0" encoding="utf-8"?>
+<w:hdr xmlns:m="http://schemas.openxmlformats.org/officeDocument/2006/math" xmlns:mc="http://schemas.openxmlformats.org/markup-compatibility/2006" xmlns:mo="http://schemas.microsoft.com/office/mac/office/2008/main" xmlns:mv="urn:schemas-microsoft-com:mac:vml" xmlns:o="urn:schemas-microsoft-com:office:office" xmlns:r="http://schemas.openxmlformats.org/officeDocument/2006/relationships" xmlns:v="urn:schemas-microsoft-com:vml" xmlns:w10="urn:schemas-microsoft-com:office:word" xmlns:w14="http://schemas.microsoft.com/office/word/2010/wordml" xmlns:w="http://schemas.openxmlformats.org/wordprocessingml/2006/main" xmlns:wne="http://schemas.microsoft.com/office/word/2006/wordml" xmlns:wp14="http://schemas.microsoft.com/office/word/2010/wordprocessingDrawing" xmlns:wp="http://schemas.openxmlformats.org/drawingml/2006/wordprocessingDrawing" xmlns:wpc="http://schemas.microsoft.com/office/word/2010/wordprocessingCanvas" xmlns:wpg="http://schemas.microsoft.com/office/word/2010/wordprocessingGroup" xmlns:wpi="http://schemas.microsoft.com/office/word/2010/wordprocessingInk" xmlns:wps="http://schemas.microsoft.com/office/word/2010/wordprocessingShape" mc:Ignorable="w14 wp14">
+  <w:p>
+    <w:pPr>
+      <w:pStyle w:val="Header"/>
+    </w:pPr>
+  </w:p>
+</w:hdr>
+</file>
+
+<file path=word/header3.xml><?xml version="1.0" encoding="utf-8"?>
 <w:hdr xmlns:m="http://schemas.openxmlformats.org/officeDocument/2006/math" xmlns:mc="http://schemas.openxmlformats.org/markup-compatibility/2006" xmlns:mo="http://schemas.microsoft.com/office/mac/office/2008/main" xmlns:mv="urn:schemas-microsoft-com:mac:vml" xmlns:o="urn:schemas-microsoft-com:office:office" xmlns:r="http://schemas.openxmlformats.org/officeDocument/2006/relationships" xmlns:v="urn:schemas-microsoft-com:vml" xmlns:w10="urn:schemas-microsoft-com:office:word" xmlns:w14="http://schemas.microsoft.com/office/word/2010/wordml" xmlns:w="http://schemas.openxmlformats.org/wordprocessingml/2006/main" xmlns:wne="http://schemas.microsoft.com/office/word/2006/wordml" xmlns:wp14="http://schemas.microsoft.com/office/word/2010/wordprocessingDrawing" xmlns:wp="http://schemas.openxmlformats.org/drawingml/2006/wordprocessingDrawing" xmlns:wpc="http://schemas.microsoft.com/office/word/2010/wordprocessingCanvas" xmlns:wpg="http://schemas.microsoft.com/office/word/2010/wordprocessingGroup" xmlns:wpi="http://schemas.microsoft.com/office/word/2010/wordprocessingInk" xmlns:wps="http://schemas.microsoft.com/office/word/2010/wordprocessingShape" mc:Ignorable="w14 wp14">
   <w:p>
     <w:pPr>

</xml_diff>

<commit_message>
release: Angerona v1.12.0 guided defense expansion
</commit_message>
<xml_diff>
--- a/Angerona_Master_Manual.docx
+++ b/Angerona_Master_Manual.docx
@@ -110,7 +110,7 @@
           </w:tcPr>
           <w:p>
             <w:r>
-              <w:t>Current release: v1.11.0 - independent-trust hardening for authenticated telemetry continuity, hostile network paths, operator-gated response, governed AI memory, recovery assurance, and signed release boundaries.</w:t>
+              <w:t>Current release: v1.12.0 - guided, proposal-only host adaptation; an immutable Windows Firewall recovery baseline; clickable operational detail; universal capability contracts; durable integrations; and standards-truth hardening.</w:t>
             </w:r>
           </w:p>
         </w:tc>
@@ -134,7 +134,7 @@
           <w:color w:val="0B2545"/>
           <w:sz w:val="22"/>
         </w:rPr>
-        <w:t>27 August 2026</w:t>
+        <w:t>28 August 2026</w:t>
       </w:r>
     </w:p>
     <w:p>
@@ -283,7 +283,7 @@
           </w:tcPr>
           <w:p>
             <w:r>
-              <w:t>1.11.0</w:t>
+              <w:t>1.12.0</w:t>
             </w:r>
           </w:p>
         </w:tc>
@@ -337,7 +337,7 @@
                 <w:color w:val="243447"/>
                 <w:sz w:val="18"/>
               </w:rPr>
-              <w:t>Cycle 24 defensive hardening and final serial validation complete; signed deployment artifacts remain externally governed outputs</w:t>
+              <w:t>Cycle 25 three-round defensive expansion and final serial validation complete; host mutation remains exact, previewed, approved, journaled, and verified</w:t>
             </w:r>
           </w:p>
         </w:tc>
@@ -495,7 +495,7 @@
                 <w:color w:val="243447"/>
                 <w:sz w:val="18"/>
               </w:rPr>
-              <w:t>Current repository code and analysis/loop/cycle24 evidence as of 27 August 2026</w:t>
+              <w:t>Current repository code, the 80-capability machine-readable inventory, and analysis/loop/cycle25 evidence as of 28 August 2026</w:t>
             </w:r>
           </w:p>
         </w:tc>
@@ -969,7 +969,7 @@
           <w:i w:val="0"/>
           <w:color w:val="243447"/>
         </w:rPr>
-        <w:t>Angerona unifies Windows endpoint and network visibility, local evidence retention, case work, MITRE ATT&amp;CK mapping, governed containment, recovery, local AI assistance, and non-destructive purple-team validation. Its current discovery contract covers 80 Windows, 14 Linux, and 13 macOS defensive modules sharing a typed EventBus and explicit platform contracts.</w:t>
+        <w:t>Angerona unifies Windows endpoint and network visibility, local evidence retention, case work, MITRE ATT&amp;CK mapping, governed containment, recovery, local AI assistance, and non-destructive purple-team validation. The v1.12 inventory discovers 80 defensive capabilities. Every capability receives a validated operational contract and health snapshot; five declare native contracts and 75 use explicit compatibility adapters. Product version and individual module versions remain separate.</w:t>
       </w:r>
     </w:p>
     <w:tbl>
@@ -1697,11 +1697,6 @@
         </w:tc>
       </w:tr>
     </w:tbl>
-    <w:p>
-      <w:pPr>
-        <w:spacing w:after="40"/>
-      </w:pPr>
-    </w:p>
     <w:p>
       <w:pPr>
         <w:pStyle w:val="Heading1"/>
@@ -4817,13 +4812,52 @@
     <w:p>
       <w:pPr/>
       <w:r>
-        <w:t>The dashboard now includes a bounded Live Defense Activity card for observable operational activity. It requests at most 16 recent public events, displays at most five sanitized rows, and refreshes through the existing dashboard cadence. It reads timestamp, severity, module, and public message only; Event.details, local identifiers, credentials, source code, and private model reasoning are outside the card's boundary.</w:t>
+        <w:t>The dashboard includes bounded Live Defense Activity. Its compact rows remain sanitized, but each eligible row is now clickable and opens a governed read-only evidence view with available event, subject, source, lineage, command, authenticity, fingerprint, and file-path fields. Missing or restricted fields stay explicit rather than being invented.</w:t>
       </w:r>
     </w:p>
     <w:p>
       <w:pPr/>
       <w:r>
-        <w:t>Use this surface to confirm coarse module and EventBus activity, then open Live Alerts, Forensics, or Local SOC for evidence. It is not a debugger, code tracer, evidence viewer, live-code display, or chain-of-thought window.</w:t>
+        <w:t>Use Live Defense Activity to move from a coarse signal into bounded evidence and explanation. It never exposes source code, secrets, hidden model reasoning, or chain of thought; 'thinking' means a documented event interpretation and provenance, not private model internals.</w:t>
+      </w:r>
+    </w:p>
+    <w:p>
+      <w:pPr>
+        <w:pStyle w:val="Heading2"/>
+        <w:keepNext/>
+      </w:pPr>
+      <w:r>
+        <w:t>5.3 Clickable capability and evidence organization</w:t>
+      </w:r>
+    </w:p>
+    <w:p>
+      <w:pPr/>
+      <w:r>
+        <w:t>Capability Center and the compact Modules view provide search, typed filters, header sorting, and click-through read-only details. Module details include contract origin, dependencies, source location, operational freshness/loss state, lifecycle, and supported actions.</w:t>
+      </w:r>
+    </w:p>
+    <w:p>
+      <w:pPr>
+        <w:pStyle w:val="ListBullet"/>
+      </w:pPr>
+      <w:r>
+        <w:t>Host Adaptation tables sort by typed severity and numeric risk. Double-click opens the complete bounded JSON record without changing state.</w:t>
+      </w:r>
+    </w:p>
+    <w:p>
+      <w:pPr>
+        <w:pStyle w:val="ListBullet"/>
+      </w:pPr>
+      <w:r>
+        <w:t>Live Alerts and event detail show available governed paths and evidence fields. A displayed path is context, not automatic permission to open, execute, delete, quarantine, or remediate it.</w:t>
+      </w:r>
+    </w:p>
+    <w:p>
+      <w:pPr>
+        <w:pStyle w:val="ListBullet"/>
+      </w:pPr>
+      <w:r>
+        <w:t>Context Info meaning/path tables are sortable and double-clickable, so menu labels, implementation locations, and security boundaries can be inspected without hunting through multiple buttons.</w:t>
       </w:r>
     </w:p>
     <w:p>
@@ -5520,6 +5554,7 @@
     <w:p>
       <w:pPr>
         <w:pStyle w:val="Heading2"/>
+        <w:pageBreakBefore/>
       </w:pPr>
       <w:r>
         <w:t>6.5 Audit Log Integrity Guard</w:t>
@@ -5550,6 +5585,7 @@
     <w:p>
       <w:pPr>
         <w:pStyle w:val="Heading2"/>
+        <w:pageBreakBefore/>
       </w:pPr>
       <w:r>
         <w:t>6.6 Zero-Trust Network Path Monitor</w:t>
@@ -6321,6 +6357,7 @@
     <w:p>
       <w:pPr>
         <w:pStyle w:val="Heading2"/>
+        <w:pageBreakBefore/>
       </w:pPr>
       <w:r>
         <w:t>7.2 Action lifecycle</w:t>
@@ -6668,7 +6705,7 @@
                 <w:color w:val="243447"/>
                 <w:sz w:val="18"/>
               </w:rPr>
-              <w:t>Builds an exact `suspend_process` contract and delegates to Combat; no direct psutil suspend.</w:t>
+              <w:t>Exact `suspend_process` contract delegated to Combat; never direct psutil.</w:t>
             </w:r>
           </w:p>
         </w:tc>
@@ -6774,7 +6811,7 @@
                 <w:color w:val="243447"/>
                 <w:sz w:val="18"/>
               </w:rPr>
-              <w:t>Observe/delegate within current exact-response boundaries; no broad cached rollback or false issuance claim.</w:t>
+              <w:t>Observe/delegate only within exact response bounds; no cached rollback or issuance claim.</w:t>
             </w:r>
           </w:p>
         </w:tc>
@@ -6826,7 +6863,7 @@
                 <w:color w:val="243447"/>
                 <w:sz w:val="18"/>
               </w:rPr>
-              <w:t>AI-authored content is inert advisory text. Only deterministic vetted remediation may enter an action path.</w:t>
+              <w:t>AI advice is inert; only vetted deterministic remediation enters an action path.</w:t>
             </w:r>
           </w:p>
         </w:tc>
@@ -7414,6 +7451,9 @@
       </w:pPr>
     </w:p>
     <w:p>
+      <w:pPr>
+        <w:pageBreakBefore/>
+      </w:pPr>
       <w:r>
         <w:rPr>
           <w:rFonts w:ascii="Calibri" w:hAnsi="Calibri" w:eastAsia="Calibri"/>
@@ -7467,7 +7507,39 @@
           <w:i w:val="0"/>
           <w:color w:val="243447"/>
         </w:rPr>
-        <w:t>Host Adaptation inventories hardware, services, listeners, network context, effective Firewall ActiveStore profiles, and a bounded rule set. It captures baselines, reports drift and collector quality, previews closed firewall-only profiles, simulates without writes, applies only after exact confirmation and verified backup, and rolls back with signed artifact verification.</w:t>
+        <w:t>Host Adaptation inventories hardware, services, listeners, network context, and Windows Firewall state. Auto Adapt prompts for Balanced, Public, or Emergency Lockdown posture, audits completeness, builds an immutable plan, and simulates without writes. Apply still requires a second exact-command approval; automation remains proposal-only.</w:t>
+      </w:r>
+    </w:p>
+    <w:p>
+      <w:pPr>
+        <w:pStyle w:val="ListBullet"/>
+      </w:pPr>
+      <w:r>
+        <w:t>Enroll Recovery Baseline stores one exclusive, host-bound, authenticated, digest-verified complete Windows Firewall policy; it cannot silently replace the anchor.</w:t>
+      </w:r>
+    </w:p>
+    <w:p>
+      <w:pPr>
+        <w:pStyle w:val="ListBullet"/>
+      </w:pPr>
+      <w:r>
+        <w:t>Restore snapshots pre-state, journals the action, verifies exact firewall state, and compensates or declares recovery-required.</w:t>
+      </w:r>
+    </w:p>
+    <w:p>
+      <w:pPr>
+        <w:pStyle w:val="ListBullet"/>
+      </w:pPr>
+      <w:r>
+        <w:t>Safe automatic checkup audits once and simulates every profile without writes; it never remediates unattended.</w:t>
+      </w:r>
+    </w:p>
+    <w:p>
+      <w:pPr>
+        <w:pStyle w:val="ListBullet"/>
+      </w:pPr>
+      <w:r>
+        <w:t>The baseline restores only firewall policy; hardware, services, ports, and network context remain observational.</w:t>
       </w:r>
     </w:p>
     <w:p>
@@ -7490,7 +7562,7 @@
           <w:rFonts w:ascii="Calibri" w:hAnsi="Calibri" w:eastAsia="Calibri"/>
           <w:color w:val="243447"/>
         </w:rPr>
-        <w:t>Watchdog and supervisor track liveness, use bounded restart/backoff, and surface safe mode rather than uncontrolled loops.</w:t>
+        <w:t>Watchdog and supervisor use bounded restart/backoff and safe mode, never uncontrolled loops.</w:t>
       </w:r>
     </w:p>
     <w:p>
@@ -7505,7 +7577,7 @@
           <w:rFonts w:ascii="Calibri" w:hAnsi="Calibri" w:eastAsia="Calibri"/>
           <w:color w:val="243447"/>
         </w:rPr>
-        <w:t>Event and storage lanes are bounded, batch where durability permits, and use durable fallback when asynchronous queues saturate.</w:t>
+        <w:t>Event and storage lanes are bounded, batch safely, and fall back durably when queues saturate.</w:t>
       </w:r>
     </w:p>
     <w:p>
@@ -7520,7 +7592,7 @@
           <w:rFonts w:ascii="Calibri" w:hAnsi="Calibri" w:eastAsia="Calibri"/>
           <w:color w:val="243447"/>
         </w:rPr>
-        <w:t>Source Sandbox is inert, confines paths, rejects runtime installers, and does not hot-reload production code.</w:t>
+        <w:t>Source Sandbox is inert and path-confined; it rejects installers and never hot-reloads production code.</w:t>
       </w:r>
     </w:p>
     <w:p>
@@ -7535,7 +7607,7 @@
           <w:rFonts w:ascii="Calibri" w:hAnsi="Calibri" w:eastAsia="Calibri"/>
           <w:color w:val="243447"/>
         </w:rPr>
-        <w:t>Shutdown helpers verify exact Angerona launch grammar and process creation time; test runners and substring lookalikes are excluded.</w:t>
+        <w:t>Shutdown helpers verify exact launches and process birth, excluding test and substring lookalikes.</w:t>
       </w:r>
     </w:p>
     <w:p>
@@ -7655,7 +7727,7 @@
           <w:rFonts w:ascii="Calibri" w:hAnsi="Calibri" w:eastAsia="Calibri"/>
           <w:color w:val="243447"/>
         </w:rPr>
-        <w:t>Run a fresh technique-bound campaign. Only new evidence can close a gap; a later miss reopens it.</w:t>
+        <w:t>Run a fresh technique-bound campaign. Only fresh evidence closes a gap; a later miss reopens it.</w:t>
       </w:r>
     </w:p>
     <w:p>
@@ -7880,7 +7952,7 @@
                 <w:rFonts w:ascii="Calibri" w:hAnsi="Calibri" w:eastAsia="Calibri"/>
                 <w:color w:val="243447"/>
               </w:rPr>
-              <w:t>Do not delete the journal, bulk-delete firewall policy, kill processes by name, or move protected evidence to clear an error. Preserve the signed record and recover the exact action target.</w:t>
+              <w:t>Do not delete the journal, bulk-delete firewall policy, kill processes by name, or move protected evidence. Preserve the signed record and recover only the exact target.</w:t>
             </w:r>
           </w:p>
         </w:tc>
@@ -7946,7 +8018,7 @@
                 <w:rFonts w:ascii="Calibri" w:hAnsi="Calibri" w:eastAsia="Calibri"/>
                 <w:b/>
                 <w:color w:val="0B2545"/>
-                <w:sz w:val="18"/>
+                <w:sz w:val="19"/>
               </w:rPr>
               <w:t>Gate</w:t>
             </w:r>
@@ -7974,7 +8046,7 @@
                 <w:rFonts w:ascii="Calibri" w:hAnsi="Calibri" w:eastAsia="Calibri"/>
                 <w:b/>
                 <w:color w:val="0B2545"/>
-                <w:sz w:val="18"/>
+                <w:sz w:val="19"/>
               </w:rPr>
               <w:t>Final result</w:t>
             </w:r>
@@ -8001,7 +8073,7 @@
               <w:rPr>
                 <w:rFonts w:ascii="Calibri" w:hAnsi="Calibri" w:eastAsia="Calibri"/>
                 <w:color w:val="243447"/>
-                <w:sz w:val="17"/>
+                <w:sz w:val="19"/>
               </w:rPr>
               <w:t>Full pytest</w:t>
             </w:r>
@@ -8020,7 +8092,10 @@
           </w:tcPr>
           <w:p>
             <w:r>
-              <w:t>1,675 collected across 229 files; 1,670 passed; 5 expected host-capability skips; 0 failed</w:t>
+              <w:rPr>
+                <w:sz w:val="19"/>
+              </w:rPr>
+              <w:t>1,811 passed; 6 expected host/platform capability skips; 0 failed in the authoritative serial release run</w:t>
             </w:r>
           </w:p>
         </w:tc>
@@ -8046,7 +8121,7 @@
               <w:rPr>
                 <w:rFonts w:ascii="Calibri" w:hAnsi="Calibri" w:eastAsia="Calibri"/>
                 <w:color w:val="243447"/>
-                <w:sz w:val="17"/>
+                <w:sz w:val="19"/>
               </w:rPr>
               <w:t>Compile</w:t>
             </w:r>
@@ -8066,7 +8141,10 @@
           </w:tcPr>
           <w:p>
             <w:r>
-              <w:t>611/611 Python files; 345/345 product files</w:t>
+              <w:rPr>
+                <w:sz w:val="19"/>
+              </w:rPr>
+              <w:t>346/346 product Python files compiled</w:t>
             </w:r>
           </w:p>
         </w:tc>
@@ -8091,7 +8169,7 @@
               <w:rPr>
                 <w:rFonts w:ascii="Calibri" w:hAnsi="Calibri" w:eastAsia="Calibri"/>
                 <w:color w:val="243447"/>
-                <w:sz w:val="17"/>
+                <w:sz w:val="19"/>
               </w:rPr>
               <w:t>Static/runtime quality</w:t>
             </w:r>
@@ -8116,9 +8194,9 @@
               <w:rPr>
                 <w:rFonts w:ascii="Calibri" w:hAnsi="Calibri" w:eastAsia="Calibri"/>
                 <w:color w:val="243447"/>
-                <w:sz w:val="17"/>
+                <w:sz w:val="19"/>
               </w:rPr>
-              <w:t>Ruff; 80 Windows / 14 Linux / 13 macOS discovery; zero discovery errors; documentation-drift and patch-integrity gates passed</w:t>
+              <w:t>Ruff clean; 82/82 module files imported; 80 capabilities discovered with zero errors or duplicates; documentation-drift and patch-integrity gates passed</w:t>
             </w:r>
           </w:p>
         </w:tc>
@@ -8144,7 +8222,7 @@
               <w:rPr>
                 <w:rFonts w:ascii="Calibri" w:hAnsi="Calibri" w:eastAsia="Calibri"/>
                 <w:color w:val="243447"/>
-                <w:sz w:val="17"/>
+                <w:sz w:val="19"/>
               </w:rPr>
               <w:t>Module self-tests</w:t>
             </w:r>
@@ -8164,7 +8242,10 @@
           </w:tcPr>
           <w:p>
             <w:r>
-              <w:t>60 genuine pass; 0 genuine fail; 21 expected inactive/platform skips; EventBus pipeline passed</w:t>
+              <w:rPr>
+                <w:sz w:val="19"/>
+              </w:rPr>
+              <w:t>92 pass; 12 expected inactive/platform skips; EventBus pipeline passed</w:t>
             </w:r>
           </w:p>
         </w:tc>
@@ -8189,7 +8270,7 @@
               <w:rPr>
                 <w:rFonts w:ascii="Calibri" w:hAnsi="Calibri" w:eastAsia="Calibri"/>
                 <w:color w:val="243447"/>
-                <w:sz w:val="17"/>
+                <w:sz w:val="19"/>
               </w:rPr>
               <w:t>Core/Shark</w:t>
             </w:r>
@@ -8214,7 +8295,7 @@
               <w:rPr>
                 <w:rFonts w:ascii="Calibri" w:hAnsi="Calibri" w:eastAsia="Calibri"/>
                 <w:color w:val="243447"/>
-                <w:sz w:val="17"/>
+                <w:sz w:val="19"/>
               </w:rPr>
               <w:t>22/22 passed</w:t>
             </w:r>
@@ -8242,7 +8323,7 @@
               <w:rPr>
                 <w:rFonts w:ascii="Calibri" w:hAnsi="Calibri" w:eastAsia="Calibri"/>
                 <w:color w:val="243447"/>
-                <w:sz w:val="17"/>
+                <w:sz w:val="19"/>
               </w:rPr>
               <w:t>ARIA</w:t>
             </w:r>
@@ -8268,7 +8349,7 @@
               <w:rPr>
                 <w:rFonts w:ascii="Calibri" w:hAnsi="Calibri" w:eastAsia="Calibri"/>
                 <w:color w:val="243447"/>
-                <w:sz w:val="17"/>
+                <w:sz w:val="19"/>
               </w:rPr>
               <w:t>15/15 passed</w:t>
             </w:r>
@@ -8295,7 +8376,7 @@
               <w:rPr>
                 <w:rFonts w:ascii="Calibri" w:hAnsi="Calibri" w:eastAsia="Calibri"/>
                 <w:color w:val="243447"/>
-                <w:sz w:val="17"/>
+                <w:sz w:val="19"/>
               </w:rPr>
               <w:t>Application selfcheck</w:t>
             </w:r>
@@ -8320,9 +8401,9 @@
               <w:rPr>
                 <w:rFonts w:ascii="Calibri" w:hAnsi="Calibri" w:eastAsia="Calibri"/>
                 <w:color w:val="243447"/>
-                <w:sz w:val="17"/>
+                <w:sz w:val="19"/>
               </w:rPr>
-              <w:t>26/26 passed</w:t>
+              <w:t>26/26 passed in both direct and batch entry points</w:t>
             </w:r>
           </w:p>
         </w:tc>
@@ -8348,7 +8429,7 @@
               <w:rPr>
                 <w:rFonts w:ascii="Calibri" w:hAnsi="Calibri" w:eastAsia="Calibri"/>
                 <w:color w:val="243447"/>
-                <w:sz w:val="17"/>
+                <w:sz w:val="19"/>
               </w:rPr>
               <w:t>Dependency audit</w:t>
             </w:r>
@@ -8374,7 +8455,7 @@
               <w:rPr>
                 <w:rFonts w:ascii="Calibri" w:hAnsi="Calibri" w:eastAsia="Calibri"/>
                 <w:color w:val="243447"/>
-                <w:sz w:val="17"/>
+                <w:sz w:val="19"/>
               </w:rPr>
               <w:t>pip-audit reported no known vulnerabilities</w:t>
             </w:r>
@@ -8401,7 +8482,7 @@
               <w:rPr>
                 <w:rFonts w:ascii="Calibri" w:hAnsi="Calibri" w:eastAsia="Calibri"/>
                 <w:color w:val="243447"/>
-                <w:sz w:val="17"/>
+                <w:sz w:val="19"/>
               </w:rPr>
               <w:t>Combat negative controls</w:t>
             </w:r>
@@ -8426,7 +8507,7 @@
               <w:rPr>
                 <w:rFonts w:ascii="Calibri" w:hAnsi="Calibri" w:eastAsia="Calibri"/>
                 <w:color w:val="243447"/>
-                <w:sz w:val="17"/>
+                <w:sz w:val="19"/>
               </w:rPr>
               <w:t>128/128 passed</w:t>
             </w:r>
@@ -8454,7 +8535,7 @@
               <w:rPr>
                 <w:rFonts w:ascii="Calibri" w:hAnsi="Calibri" w:eastAsia="Calibri"/>
                 <w:color w:val="243447"/>
-                <w:sz w:val="17"/>
+                <w:sz w:val="19"/>
               </w:rPr>
               <w:t>Live Combat winning round</w:t>
             </w:r>
@@ -8480,7 +8561,7 @@
               <w:rPr>
                 <w:rFonts w:ascii="Calibri" w:hAnsi="Calibri" w:eastAsia="Calibri"/>
                 <w:color w:val="243447"/>
-                <w:sz w:val="17"/>
+                <w:sz w:val="19"/>
               </w:rPr>
               <w:t>52/52 detect; 52/52 respond; 13/13 contracts; 13/13 verified closure; resilience PASS</w:t>
             </w:r>
@@ -8507,7 +8588,7 @@
               <w:rPr>
                 <w:rFonts w:ascii="Calibri" w:hAnsi="Calibri" w:eastAsia="Calibri"/>
                 <w:color w:val="243447"/>
-                <w:sz w:val="17"/>
+                <w:sz w:val="19"/>
               </w:rPr>
               <w:t>Live cleanup</w:t>
             </w:r>
@@ -8532,7 +8613,7 @@
               <w:rPr>
                 <w:rFonts w:ascii="Calibri" w:hAnsi="Calibri" w:eastAsia="Calibri"/>
                 <w:color w:val="243447"/>
-                <w:sz w:val="17"/>
+                <w:sz w:val="19"/>
               </w:rPr>
               <w:t>0 active reversible; 0 Angerona-Combat firewall rules; 0 tagged probes; blank integrity error; 0 legacy unsigned; 2,220 signed records</w:t>
             </w:r>
@@ -8546,6 +8627,9 @@
           </w:tcPr>
           <w:p>
             <w:r>
+              <w:rPr>
+                <w:sz w:val="19"/>
+              </w:rPr>
               <w:t>App Control evidence</w:t>
             </w:r>
           </w:p>
@@ -8556,6 +8640,9 @@
           </w:tcPr>
           <w:p>
             <w:r>
+              <w:rPr>
+                <w:sz w:val="19"/>
+              </w:rPr>
               <w:t>35/35 focused; live read-only sample 256/256 parsed and 107/107 complete correlations; independent late-clear fixture replayed 6/6 exactly once</w:t>
             </w:r>
           </w:p>
@@ -8576,165 +8663,79 @@
       </w:r>
     </w:p>
     <w:p>
-      <w:pPr/>
+      <w:pPr>
+        <w:pStyle w:val="ListBullet"/>
+      </w:pPr>
       <w:r>
-        <w:t>App Control signature cardinality, restart persistence, hard bounds, path privacy, retained-range gaps, clear/refill, and checkpoint timing races now have deterministic regression coverage.</w:t>
+        <w:t>Configuration and Settings changes are atomic or compensated; alert identity is stable; analysis work is bounded to two active and six queued jobs.</w:t>
+      </w:r>
+    </w:p>
+    <w:p>
+      <w:pPr>
+        <w:pStyle w:val="ListBullet"/>
+      </w:pPr>
+      <w:r>
+        <w:t>Durable integration outboxes, atomic Intel Sync replacement, typed persistence completeness, and explicit cancellation preserve failure truth across restart.</w:t>
+      </w:r>
+    </w:p>
+    <w:p>
+      <w:pPr>
+        <w:pStyle w:val="ListBullet"/>
+      </w:pPr>
+      <w:r>
+        <w:t>Allow/Undo is scoped and expiring, SOAR archive is recoverable, and remediation binds exact process birth, driver prior state, and firewall identity.</w:t>
+      </w:r>
+    </w:p>
+    <w:p>
+      <w:pPr>
+        <w:pStyle w:val="ListBullet"/>
+      </w:pPr>
+      <w:r>
+        <w:t>The six pytest skips are declared host/platform capability gates; structured classification cannot waive an unknown failure.</w:t>
+      </w:r>
+    </w:p>
+    <w:p>
+      <w:pPr>
+        <w:pStyle w:val="Heading2"/>
+      </w:pPr>
+      <w:r>
+        <w:t>13.2 Cycle 25 final validation</w:t>
       </w:r>
     </w:p>
     <w:p>
       <w:pPr/>
       <w:r>
-        <w:t>Selfcheck uses structured skip classification and an explicit stopped-module allowlist; incidental timeout text and unknown stopped states cannot waive a real failure.</w:t>
+        <w:t>Three sequential Cycle 25 loops combined adversarial review, visionary design, current upstream project comparison, implementation, remediation, bug testing, and performance measurement. All 80 discovered capabilities were inspected through one enforceable v1.12 contract and inventory path.</w:t>
+      </w:r>
+    </w:p>
+    <w:p>
+      <w:pPr>
+        <w:pStyle w:val="ListBullet"/>
+      </w:pPr>
+      <w:r>
+        <w:t>The authoritative serial suite passed 1,811 tests with six expected host/platform capability skips and zero failures.</w:t>
+      </w:r>
+    </w:p>
+    <w:p>
+      <w:pPr>
+        <w:pStyle w:val="ListBullet"/>
+      </w:pPr>
+      <w:r>
+        <w:t>All 346 product Python files compiled. Ruff passed; 82 module files imported; 64 register hooks validated; 80 capabilities discovered with zero errors or duplicates; the inventory contains 61 unique capability codes.</w:t>
+      </w:r>
+    </w:p>
+    <w:p>
+      <w:pPr>
+        <w:pStyle w:val="ListBullet"/>
+      </w:pPr>
+      <w:r>
+        <w:t>The module/self-test gate recorded 92 passes and 12 expected inactive or platform skips plus a passing EventBus pipeline. Direct and batch application selfcheck both passed 26 of 26.</w:t>
       </w:r>
     </w:p>
     <w:p>
       <w:pPr/>
       <w:r>
-        <w:t>Contextual Info, Settings source sandboxes, and the Red Team editor fail soft. A ContextInfo-owned timer closes cleanly during rapid heatmap/upgrade shutdown, and the ATT&amp;CK heatmap remains usable at 800x600.</w:t>
-      </w:r>
-    </w:p>
-    <w:p>
-      <w:pPr>
-        <w:numPr>
-          <w:ilvl w:val="0"/>
-          <w:numId w:val="10"/>
-        </w:numPr>
-      </w:pPr>
-      <w:r>
-        <w:rPr>
-          <w:rFonts w:ascii="Calibri" w:hAnsi="Calibri" w:eastAsia="Calibri"/>
-          <w:color w:val="243447"/>
-        </w:rPr>
-        <w:t>Stale exact-contract test fixtures now prove signed authority and include uncontracted negative cases.</w:t>
-      </w:r>
-    </w:p>
-    <w:p>
-      <w:pPr>
-        <w:numPr>
-          <w:ilvl w:val="0"/>
-          <w:numId w:val="10"/>
-        </w:numPr>
-      </w:pPr>
-      <w:r>
-        <w:rPr>
-          <w:rFonts w:ascii="Calibri" w:hAnsi="Calibri" w:eastAsia="Calibri"/>
-          <w:color w:val="243447"/>
-        </w:rPr>
-        <w:t>Combat Undo controls disable correctly on empty or unverified-only history.</w:t>
-      </w:r>
-    </w:p>
-    <w:p>
-      <w:pPr>
-        <w:numPr>
-          <w:ilvl w:val="0"/>
-          <w:numId w:val="10"/>
-        </w:numPr>
-      </w:pPr>
-      <w:r>
-        <w:rPr>
-          <w:rFonts w:ascii="Calibri" w:hAnsi="Calibri" w:eastAsia="Calibri"/>
-          <w:color w:val="243447"/>
-        </w:rPr>
-        <w:t>Posture advisory paths persist while the output remains unconditionally non-executable.</w:t>
-      </w:r>
-    </w:p>
-    <w:p>
-      <w:pPr>
-        <w:numPr>
-          <w:ilvl w:val="0"/>
-          <w:numId w:val="10"/>
-        </w:numPr>
-      </w:pPr>
-      <w:r>
-        <w:rPr>
-          <w:rFonts w:ascii="Calibri" w:hAnsi="Calibri" w:eastAsia="Calibri"/>
-          <w:color w:val="243447"/>
-        </w:rPr>
-        <w:t>Red Team rapid reruns snapshot and clean exact prior run artifacts in the correct order.</w:t>
-      </w:r>
-    </w:p>
-    <w:p>
-      <w:pPr>
-        <w:numPr>
-          <w:ilvl w:val="0"/>
-          <w:numId w:val="10"/>
-        </w:numPr>
-      </w:pPr>
-      <w:r>
-        <w:rPr>
-          <w:rFonts w:ascii="Calibri" w:hAnsi="Calibri" w:eastAsia="Calibri"/>
-          <w:color w:val="243447"/>
-        </w:rPr>
-        <w:t>SOAR receipt reconciliation proves signed success, failure, timeout, and unsigned-lookalike refusal.</w:t>
-      </w:r>
-    </w:p>
-    <w:p>
-      <w:pPr>
-        <w:numPr>
-          <w:ilvl w:val="0"/>
-          <w:numId w:val="10"/>
-        </w:numPr>
-      </w:pPr>
-      <w:r>
-        <w:rPr>
-          <w:rFonts w:ascii="Calibri" w:hAnsi="Calibri" w:eastAsia="Calibri"/>
-          <w:color w:val="243447"/>
-        </w:rPr>
-        <w:t>Selfcheck now verifies inert model advice instead of expecting execution.</w:t>
-      </w:r>
-    </w:p>
-    <w:p>
-      <w:r>
-        <w:rPr>
-          <w:rFonts w:ascii="Calibri" w:hAnsi="Calibri" w:eastAsia="Calibri"/>
-          <w:i w:val="0"/>
-          <w:color w:val="243447"/>
-        </w:rPr>
-        <w:t>The five skipped pytest cases are expected host-capability gates. Expected inactive module results identify stopped sensors, idle or unarmed SOAR or Combat, unavailable optional Ollama, and unsupported platform features; they are not hidden failures.</w:t>
-      </w:r>
-    </w:p>
-    <w:p>
-      <w:pPr>
-        <w:pStyle w:val="Heading2"/>
-      </w:pPr>
-      <w:r>
-        <w:t>13.2 Cycle 23 final validation</w:t>
-      </w:r>
-    </w:p>
-    <w:p>
-      <w:pPr/>
-      <w:r>
-        <w:t>Three sequential defensive review rounds closed 15 findings: Round 1 fixed nine; Round 2 fixed five and retained one independently administered high-water authority as deferred; Round 3 found and fixed one physical-path restart-continuity defect. The final actor-neutral review reproduced no remaining Cycle 23 Critical or High issue and did not re-label the external dependency as shipped.</w:t>
-      </w:r>
-    </w:p>
-    <w:p>
-      <w:pPr>
-        <w:pStyle w:val="ListBullet"/>
-      </w:pPr>
-      <w:r>
-        <w:t>The authoritative one-process suite collected 1,465 tests across 208 files: 1,460 passed, five expected host-capability skips, and zero failed.</w:t>
-      </w:r>
-    </w:p>
-    <w:p>
-      <w:pPr>
-        <w:pStyle w:val="ListBullet"/>
-      </w:pPr>
-      <w:r>
-        <w:t>All 321 product Python files compiled. Ruff passed; 73 module files imported; 71 of 71 modules discovered; all 58 compatibility register hooks were valid; core and Shark self-tests passed 22 of 22.</w:t>
-      </w:r>
-    </w:p>
-    <w:p>
-      <w:pPr>
-        <w:pStyle w:val="ListBullet"/>
-      </w:pPr>
-      <w:r>
-        <w:t>The module harness produced 50 passes, zero failures, and 21 explicit inactive/platform skips plus a passing EventBus pipeline. Direct and batch selfcheck both passed 26 of 26.</w:t>
-      </w:r>
-    </w:p>
-    <w:p>
-      <w:pPr/>
-      <w:r>
-        <w:t>These gates are strong project evidence, not independent certification, state-actor attribution, or proof of complete attack coverage.</w:t>
+        <w:t>These gates are strong project evidence, not independent certification, commercial EDR parity, attribution, or proof of complete attack coverage.</w:t>
       </w:r>
     </w:p>
     <w:p>
@@ -9353,7 +9354,7 @@
           <w:rFonts w:ascii="Calibri" w:hAnsi="Calibri" w:eastAsia="Calibri"/>
           <w:color w:val="243447"/>
         </w:rPr>
-        <w:t>Signed Combat journal segmentation remains proposed until forged-prefix, crash-between-segment, rotation, recovery, and old-action Undo tests exist.</w:t>
+        <w:t>Durable exporter batch commits remain proposed until crash, ordering, partial-acknowledgement, and replay equivalence are proven.</w:t>
       </w:r>
     </w:p>
     <w:p>
@@ -9368,7 +9369,7 @@
           <w:rFonts w:ascii="Calibri" w:hAnsi="Calibri" w:eastAsia="Calibri"/>
           <w:color w:val="243447"/>
         </w:rPr>
-        <w:t>Ollama listener ownership is not cached; a short cache could create a process/port replacement window. An OS-native listener-bound proof is the prerequisite.</w:t>
+        <w:t>Immutable compiled Sigma evaluation plans remain proposed until atomic admission, rule-generation, cache invalidation, and refusal tests are complete.</w:t>
       </w:r>
     </w:p>
     <w:p>
@@ -9383,7 +9384,7 @@
           <w:rFonts w:ascii="Calibri" w:hAnsi="Calibri" w:eastAsia="Calibri"/>
           <w:color w:val="243447"/>
         </w:rPr>
-        <w:t>First-run Sysmon seek and asynchronous initial ARIA manager/index construction remain proposed pending Windows-native cursor and startup lifecycle tests.</w:t>
+        <w:t>A global per-CVE detail-worker cap remains proposed so bursts across many distinct CVEs cannot exceed the already bounded per-item UI work.</w:t>
       </w:r>
     </w:p>
     <w:p>
@@ -9391,19 +9392,19 @@
         <w:pStyle w:val="Heading2"/>
       </w:pPr>
       <w:r>
-        <w:t>14.2 Cycle 23 measured hot-path decisions</w:t>
+        <w:t>14.2 Cycle 25 measured hot-path decisions</w:t>
       </w:r>
     </w:p>
     <w:p>
       <w:pPr/>
       <w:r>
-        <w:t>Round 1 avoided redundant unchanged audit-state writes (97.6% in the measured case), limited SSH command-line work to admitted clients (90.9%), and skipped rebuilding an already-untrusted immutable network snapshot (93.3%). Round 2 replaced quadratic per-user SSH token expansion with one bounded pass, improving token-heavy stress cases by 98.8% to 99.4%.</w:t>
+        <w:t>The final gate moved the recorder's normal handoff to an exact-capacity C-backed queue, improving the measured path from 22.306 to 15.925 microseconds per event (28.6%) while preserving bounded loss accounting.</w:t>
       </w:r>
     </w:p>
     <w:p>
       <w:pPr/>
       <w:r>
-        <w:t>Round 3 retained direct pending-path security logic after maximum-bound evaluation measured 2.817 to 3.113 ms and proposed alternatives were either negligible at the 64-path cap or slower in normal/stress cases. Security clarity, freshness checks, anchors, retries, and pre/post route observations were not traded for benchmark numbers.</w:t>
+        <w:t>Immutable capability summaries improved from 43.324 to 1.508 microseconds per call (96.5%). Revision-gated, fingerprinted Module Inspector refresh reduced unchanged ticks from 13.458 to 0.474 ms (96.5%) without weakening freshness, evidence, or click-through detail.</w:t>
       </w:r>
     </w:p>
     <w:p>
@@ -9449,7 +9450,7 @@
           </w:tcPr>
           <w:p>
             <w:r>
-              <w:t>Final red-team verdict: No open Critical, High, or Medium Cycle 24 code blocker remains in the current v1.11.0 tree. Publisher/root custody, clean-machine package validation, hardware rollback resistance, and the external gates below remain outstanding acceptance work.</w:t>
+              <w:t>Final red-team verdict: No open Critical, High, or Medium Cycle 25 code blocker remains in the current v1.12.0 tree. Clean-machine deployment, publisher custody, hardware-backed rollback resistance, fleet-scale trials, and independent efficacy review remain external acceptance work.</w:t>
             </w:r>
           </w:p>
         </w:tc>
@@ -9579,6 +9580,7 @@
     <w:p>
       <w:pPr>
         <w:pStyle w:val="Heading2"/>
+        <w:pageBreakBefore/>
       </w:pPr>
       <w:r>
         <w:t>15.3 Current research backlog</w:t>
@@ -9586,7 +9588,7 @@
     </w:p>
     <w:p>
       <w:r>
-        <w:t>The ranked next work is a digest-pinned ATT&amp;CK v19.2 registry, a protected PowerShell Operational/4104 sensor, an EPSS v5 + KEV + SSVC host-risk queue, event-driven Task Scheduler/BITS persistence evidence, and an App Control policy-inventory lifecycle. These are proposals, not current product claims.</w:t>
+        <w:t>ATT&amp;CK 19.2, Navigator 5.3.2/layer 4.5, constrained OCSF 1.8, and atomic Sigma admission are now pinned and regression-tested. Ranked next work is the three measured proposals in section 14.1 plus physical Windows soak, clean-machine packaging, fleet-scale throughput, and independent false-positive and efficacy evaluation.</w:t>
       </w:r>
     </w:p>
     <w:p>
@@ -9594,7 +9596,7 @@
         <w:pStyle w:val="Heading2"/>
       </w:pPr>
       <w:r>
-        <w:t>15.4 Cycle 23 assurance boundary</w:t>
+        <w:t>15.4 Inherited Cycle 23 assurance boundary</w:t>
       </w:r>
     </w:p>
     <w:p>
@@ -10232,7 +10234,7 @@
           <w:i w:val="0"/>
           <w:color w:val="243447"/>
         </w:rPr>
-        <w:t>Candid rating: rare and ambitious for a home-lab project, viable as an advanced local security lab, and valuable on a resume when the owner can explain and defend the engineering. It is not a unicorn or commercial contender yet. The differentiator is not the feature count alone; it is the combination of exact response authority, truthful receipts, recovery, red-team closure, performance evidence, and explicit limitations.</w:t>
+        <w:t>Candid rating: a credible advanced local security lab, not a commercial-parity claim. Its value is explainable exact authority, truthful receipts, verified recovery, red-team closure, measured performance, and explicit limits.</w:t>
       </w:r>
     </w:p>
     <w:p>
@@ -11190,6 +11192,58 @@
           </w:p>
         </w:tc>
       </w:tr>
+      <w:tr>
+        <w:trPr>
+          <w:cantSplit/>
+        </w:trPr>
+        <w:tc>
+          <w:tcPr>
+            <w:tcW w:type="dxa" w:w="1550"/>
+          </w:tcPr>
+          <w:p>
+            <w:r>
+              <w:t>1.11.0</w:t>
+            </w:r>
+          </w:p>
+        </w:tc>
+        <w:tc>
+          <w:tcPr>
+            <w:tcW w:type="dxa" w:w="7810"/>
+          </w:tcPr>
+          <w:p>
+            <w:r>
+              <w:t>Independent-trust, authenticated continuity, hostile-path, governed memory, recovery-assurance, and signed-release boundary hardening.</w:t>
+            </w:r>
+            <w:r/>
+          </w:p>
+        </w:tc>
+      </w:tr>
+      <w:tr>
+        <w:trPr>
+          <w:cantSplit/>
+        </w:trPr>
+        <w:tc>
+          <w:tcPr>
+            <w:tcW w:type="dxa" w:w="1550"/>
+          </w:tcPr>
+          <w:p>
+            <w:r>
+              <w:t>1.12.0</w:t>
+            </w:r>
+          </w:p>
+        </w:tc>
+        <w:tc>
+          <w:tcPr>
+            <w:tcW w:type="dxa" w:w="7810"/>
+          </w:tcPr>
+          <w:p>
+            <w:r>
+              <w:t>Guided Auto Adapt, immutable firewall recovery baseline, safe all-profile checkup, clickable evidence detail, 80 universal capability contracts, durable integrations, and pinned standards truth.</w:t>
+            </w:r>
+            <w:r/>
+          </w:p>
+        </w:tc>
+      </w:tr>
     </w:tbl>
     <w:p>
       <w:pPr>
@@ -11267,6 +11321,7 @@
     <w:p>
       <w:pPr>
         <w:pStyle w:val="Heading2"/>
+        <w:pageBreakBefore/>
       </w:pPr>
       <w:r>
         <w:t>17.2 Automatic Red Team validation correction (2026-08-25)</w:t>
@@ -11429,6 +11484,7 @@
     <w:p>
       <w:pPr>
         <w:pStyle w:val="Heading2"/>
+        <w:pageBreakBefore/>
       </w:pPr>
       <w:r>
         <w:t>17.5 v1.10.3 state-grade defensive hardening (2026-08-26)</w:t>
@@ -11474,6 +11530,7 @@
       <w:pPr>
         <w:pStyle w:val="Heading2"/>
         <w:keepNext/>
+        <w:pageBreakBefore/>
       </w:pPr>
       <w:r>
         <w:t>17.6 v1.11.0 independent-trust hardening (2026-08-27)</w:t>
@@ -11537,6 +11594,76 @@
       <w:pPr/>
       <w:r>
         <w:t>These results are project evidence, not independent certification or proof against every administrator, kernel, firmware, hypervisor, supply-chain, identity, physical-access, or whole-host rollback attack.</w:t>
+      </w:r>
+    </w:p>
+    <w:p>
+      <w:pPr>
+        <w:pStyle w:val="Heading2"/>
+        <w:keepNext/>
+        <w:pageBreakBefore/>
+      </w:pPr>
+      <w:r>
+        <w:t>17.7 v1.12.0 guided-defense and capability expansion (2026-08-28)</w:t>
+      </w:r>
+    </w:p>
+    <w:p>
+      <w:pPr/>
+      <w:r>
+        <w:t>Cycle 25 combines three adversarial, visionary, and current-upstream comparison loops. It challenged authority, crashes, spoofing, races, failure truth, and usability without claiming parity.</w:t>
+      </w:r>
+    </w:p>
+    <w:p>
+      <w:pPr>
+        <w:pStyle w:val="ListBullet"/>
+      </w:pPr>
+      <w:r>
+        <w:t>Guided Auto Adapt consolidates audit, profile choice, baseline, plan, and simulation. Safe automatic checkup simulates every profile without writes; apply remains separately approved and proposal-only.</w:t>
+      </w:r>
+    </w:p>
+    <w:p>
+      <w:pPr>
+        <w:pStyle w:val="ListBullet"/>
+      </w:pPr>
+      <w:r>
+        <w:t>Capability, module, adaptation, context, live activity, alert, and path surfaces provide searchable, sortable, clickable read-only detail.</w:t>
+      </w:r>
+    </w:p>
+    <w:p>
+      <w:pPr>
+        <w:pStyle w:val="ListBullet"/>
+      </w:pPr>
+      <w:r>
+        <w:t>All 80 capabilities receive operational contracts and health snapshots: five native contracts and 75 explicit compatibility adapters.</w:t>
+      </w:r>
+    </w:p>
+    <w:p>
+      <w:pPr>
+        <w:pStyle w:val="ListBullet"/>
+      </w:pPr>
+      <w:r>
+        <w:t>Durable outboxes, atomic Intel Sync, typed persistence completeness, exact tuner approvals, protected IPC secrets, and identity-bound remediation improve restart and failure safety.</w:t>
+      </w:r>
+    </w:p>
+    <w:p>
+      <w:pPr>
+        <w:pStyle w:val="ListBullet"/>
+      </w:pPr>
+      <w:r>
+        <w:t>Standards truth is pinned to ATT&amp;CK 19.2, Navigator 5.3.2/layer 4.5, typed OCSF 1.8, and atomic Sigma admission/refusal.</w:t>
+      </w:r>
+    </w:p>
+    <w:p>
+      <w:pPr>
+        <w:pStyle w:val="ListBullet"/>
+      </w:pPr>
+      <w:r>
+        <w:t>Final evidence: 1,811 tests passed, six expected capability skips, zero failed; 346 product files compiled; Ruff, 80-capability discovery, module/self-test gates, and both 26-of-26 selfchecks passed.</w:t>
+      </w:r>
+    </w:p>
+    <w:p>
+      <w:pPr/>
+      <w:r>
+        <w:t>Comparison does not certify parity with Velociraptor, Wazuh, Fleet, osquery, Elastic, or commercial EDR/XDR. The immutable baseline restores Angerona-managed firewall policy, not every host setting.</w:t>
       </w:r>
     </w:p>
     <w:p>
@@ -12244,6 +12371,7 @@
     <w:p>
       <w:pPr>
         <w:pStyle w:val="Heading1"/>
+        <w:pageBreakBefore/>
       </w:pPr>
       <w:r>
         <w:t>Appendix B. Evidence sources</w:t>
@@ -12256,7 +12384,7 @@
           <w:i w:val="0"/>
           <w:color w:val="243447"/>
         </w:rPr>
-        <w:t>Repository evidence: analysis/loop/LOOP_LOG.md; analysis/loop/cycle23 and cycle24 research and round1-round3 findings, remediation, bug-test, performance, and visionary summaries; final Combat validation artifacts; and the current source/tests.</w:t>
+        <w:t>Repository evidence: analysis/loop/LOOP_LOG.md; analysis/loop/cycle23, cycle24, and cycle25 research and round1-round3 findings, dispositions, remediation, bug-test, performance, comparison, and final summaries; analysis/capability_inventory_v12.json; and the current source/tests.</w:t>
       </w:r>
     </w:p>
     <w:p>
@@ -12485,6 +12613,63 @@
       <w:pPr/>
       <w:r>
         <w:t>These sources describe observable techniques and defensive priorities. A matching behavior is not proof of any agency, government, campaign, or operator.</w:t>
+      </w:r>
+    </w:p>
+    <w:p>
+      <w:pPr>
+        <w:pStyle w:val="Heading2"/>
+        <w:keepNext/>
+      </w:pPr>
+      <w:r>
+        <w:t>B.2 Cycle 25 standards and upstream comparison sources</w:t>
+      </w:r>
+    </w:p>
+    <w:p>
+      <w:pPr/>
+      <w:r>
+        <w:t>Velociraptor client monitoring and offline buffer: https://docs.velociraptor.app/docs/clients/monitoring/</w:t>
+      </w:r>
+    </w:p>
+    <w:p>
+      <w:pPr/>
+      <w:r>
+        <w:t>Velociraptor Artifact Exchange trust warning: https://docs.velociraptor.app/docs/artifacts/exchange_reference/</w:t>
+      </w:r>
+    </w:p>
+    <w:p>
+      <w:pPr/>
+      <w:r>
+        <w:t>Wazuh Active Response: https://documentation.wazuh.com/current/user-manual/capabilities/active-response/index.html</w:t>
+      </w:r>
+    </w:p>
+    <w:p>
+      <w:pPr/>
+      <w:r>
+        <w:t>Fleet GitOps policy/configuration: https://fleetdm.com/docs/configuration/yaml-files</w:t>
+      </w:r>
+    </w:p>
+    <w:p>
+      <w:pPr/>
+      <w:r>
+        <w:t>osquery configuration packs: https://osquery.readthedocs.io/en/5.12.1/deployment/configuration/</w:t>
+      </w:r>
+    </w:p>
+    <w:p>
+      <w:pPr/>
+      <w:r>
+        <w:t>Elastic detection-rules repository: https://github.com/elastic/detection-rules</w:t>
+      </w:r>
+    </w:p>
+    <w:p>
+      <w:pPr/>
+      <w:r>
+        <w:t>MITRE ATT&amp;CK: https://attack.mitre.org/ | ATT&amp;CK Navigator: https://github.com/mitre-attack/attack-navigator | OCSF schema: https://github.com/ocsf/ocsf-schema | Sigma specification: https://sigmahq.io/sigma-specification/</w:t>
+      </w:r>
+    </w:p>
+    <w:p>
+      <w:pPr/>
+      <w:r>
+        <w:t>These sources describe their own projects and standards. Cycle 25 comparison conclusions are Angerona-specific engineering inferences.</w:t>
       </w:r>
     </w:p>
     <w:p>
@@ -13119,7 +13304,7 @@
         <w:color w:val="667085"/>
         <w:sz w:val="17"/>
       </w:rPr>
-      <w:t>Angerona Suite  |  v1.11.0  |  27 August 2026</w:t>
+      <w:t>Angerona Suite  |  v1.12.0  |  28 August 2026</w:t>
     </w:r>
   </w:p>
 </w:ftr>
@@ -13139,7 +13324,7 @@
         <w:color w:val="667085"/>
         <w:sz w:val="17"/>
       </w:rPr>
-      <w:t>ANGERONA  |  MASTER MANUAL  |  v1.11.0</w:t>
+      <w:t>ANGERONA  |  MASTER MANUAL  |  v1.12.0</w:t>
     </w:r>
   </w:p>
 </w:hdr>

</xml_diff>

<commit_message>
feat: add v1.13 enterprise defense programs
</commit_message>
<xml_diff>
--- a/Angerona_Master_Manual.docx
+++ b/Angerona_Master_Manual.docx
@@ -110,7 +110,7 @@
           </w:tcPr>
           <w:p>
             <w:r>
-              <w:t>Current release: v1.12.0 - guided, proposal-only host adaptation; an immutable Windows Firewall recovery baseline; clickable operational detail; universal capability contracts; durable integrations; and standards-truth hardening.</w:t>
+              <w:t>Current release: v1.13.0 - local Fleet Center, DetectionForge, and AegisPath enterprise-pattern programs; independent adversarial re-attacks; bounded evidence; and explicit non-parity limits.</w:t>
             </w:r>
           </w:p>
         </w:tc>
@@ -134,7 +134,7 @@
           <w:color w:val="0B2545"/>
           <w:sz w:val="22"/>
         </w:rPr>
-        <w:t>28 August 2026</w:t>
+        <w:t>30 August 2026</w:t>
       </w:r>
     </w:p>
     <w:p>
@@ -283,7 +283,7 @@
           </w:tcPr>
           <w:p>
             <w:r>
-              <w:t>1.12.0</w:t>
+              <w:t>1.13.0</w:t>
             </w:r>
           </w:p>
         </w:tc>
@@ -337,7 +337,7 @@
                 <w:color w:val="243447"/>
                 <w:sz w:val="18"/>
               </w:rPr>
-              <w:t>Cycle 25 three-round defensive expansion and final serial validation complete; host mutation remains exact, previewed, approved, journaled, and verified</w:t>
+              <w:t>Cycles 31-33 implementation, remediation, independent re-attack, performance, and documentation complete; final post-documentation validation and publication pending</w:t>
             </w:r>
           </w:p>
         </w:tc>
@@ -495,7 +495,7 @@
                 <w:color w:val="243447"/>
                 <w:sz w:val="18"/>
               </w:rPr>
-              <w:t>Current repository code, the 80-capability machine-readable inventory, and analysis/loop/cycle25 evidence as of 28 August 2026</w:t>
+              <w:t>Current repository code, the 84-capability machine-readable inventory, and analysis/loop/cycles31-33-summary.md as of 30 August 2026</w:t>
             </w:r>
           </w:p>
         </w:tc>
@@ -969,7 +969,7 @@
           <w:i w:val="0"/>
           <w:color w:val="243447"/>
         </w:rPr>
-        <w:t>Angerona unifies Windows endpoint and network visibility, local evidence retention, case work, MITRE ATT&amp;CK mapping, governed containment, recovery, local AI assistance, and non-destructive purple-team validation. The v1.12 inventory discovers 80 defensive capabilities. Every capability receives a validated operational contract and health snapshot; five declare native contracts and 75 use explicit compatibility adapters. Product version and individual module versions remain separate.</w:t>
+        <w:t>Angerona unifies Windows endpoint and network visibility, local evidence retention, case work, MITRE ATT&amp;CK mapping, governed containment, recovery, local AI assistance, and non-destructive purple-team validation. The v1.13.0 inventory discovers 84 defensive capabilities. Every capability receives a validated operational contract and health snapshot; nine declare native contracts and 75 use explicit compatibility adapters. Product version, implementation label, contract maturity, and efficacy remain separate claims.</w:t>
       </w:r>
     </w:p>
     <w:tbl>
@@ -8095,7 +8095,7 @@
               <w:rPr>
                 <w:sz w:val="19"/>
               </w:rPr>
-              <w:t>1,811 passed; 6 expected host/platform capability skips; 0 failed in the authoritative serial release run</w:t>
+              <w:t>Pre-documentation full serial: 2,788 passed; 13 intentional host/platform skips; 1 expected README-marker drift failure (81 versus 84). Final post-documentation rerun pending.</w:t>
             </w:r>
           </w:p>
         </w:tc>
@@ -8144,7 +8144,7 @@
               <w:rPr>
                 <w:sz w:val="19"/>
               </w:rPr>
-              <w:t>346/346 product Python files compiled</w:t>
+              <w:t>368/368 package Python files compiled</w:t>
             </w:r>
           </w:p>
         </w:tc>
@@ -8196,7 +8196,7 @@
                 <w:color w:val="243447"/>
                 <w:sz w:val="19"/>
               </w:rPr>
-              <w:t>Ruff clean; 82/82 module files imported; 80 capabilities discovered with zero errors or duplicates; documentation-drift and patch-integrity gates passed</w:t>
+              <w:t>Ruff clean; 84 capabilities discovered with zero errors; 9 native contracts and 75 compatibility adapters; workflow policy 3/3</w:t>
             </w:r>
           </w:p>
         </w:tc>
@@ -8245,7 +8245,7 @@
               <w:rPr>
                 <w:sz w:val="19"/>
               </w:rPr>
-              <w:t>92 pass; 12 expected inactive/platform skips; EventBus pipeline passed</w:t>
+              <w:t>69 pass; 16 expected platform, disabled, or optional-prerequisite skips; 0 failed</w:t>
             </w:r>
           </w:p>
         </w:tc>
@@ -8403,7 +8403,7 @@
                 <w:color w:val="243447"/>
                 <w:sz w:val="19"/>
               </w:rPr>
-              <w:t>26/26 passed in both direct and batch entry points</w:t>
+              <w:t>26/26 passed</w:t>
             </w:r>
           </w:p>
         </w:tc>
@@ -9450,7 +9450,7 @@
           </w:tcPr>
           <w:p>
             <w:r>
-              <w:t>Final red-team verdict: No open Critical, High, or Medium Cycle 25 code blocker remains in the current v1.12.0 tree. Clean-machine deployment, publisher custody, hardware-backed rollback resistance, fleet-scale trials, and independent efficacy review remain external acceptance work.</w:t>
+              <w:t>Final red-team verdict: Cycles 31-33 fixed 31 initial findings and 15 independently discovered re-attack bypasses. No reviewed issue reopened in the final bounded gates. Fleet transport/HA, independent rollback anchors, provider PKI, clean-machine scale trials, and independent efficacy remain external work.</w:t>
             </w:r>
           </w:p>
         </w:tc>
@@ -11244,6 +11244,28 @@
           </w:p>
         </w:tc>
       </w:tr>
+      <w:tr>
+        <w:tc>
+          <w:tcPr>
+            <w:tcW w:type="dxa" w:w="1550"/>
+          </w:tcPr>
+          <w:p>
+            <w:r>
+              <w:t>1.13.0</w:t>
+            </w:r>
+          </w:p>
+        </w:tc>
+        <w:tc>
+          <w:tcPr>
+            <w:tcW w:type="dxa" w:w="7810"/>
+          </w:tcPr>
+          <w:p>
+            <w:r>
+              <w:t>Fleet Center/Fleet Fabric Lab, DetectionForge, and AegisPath; 84 capabilities (9 native, 75 adapters); 31 initial findings plus 15 re-attack bypasses fixed; explicit local-trust and non-enterprise-parity boundaries.</w:t>
+            </w:r>
+          </w:p>
+        </w:tc>
+      </w:tr>
     </w:tbl>
     <w:p>
       <w:pPr>
@@ -11664,6 +11686,75 @@
       <w:pPr/>
       <w:r>
         <w:t>Comparison does not certify parity with Velociraptor, Wazuh, Fleet, osquery, Elastic, or commercial EDR/XDR. The immutable baseline restores Angerona-managed firewall policy, not every host setting.</w:t>
+      </w:r>
+    </w:p>
+    <w:p>
+      <w:pPr>
+        <w:pStyle w:val="Heading2"/>
+        <w:keepNext/>
+      </w:pPr>
+      <w:r>
+        <w:t>17.8 v1.13.0 enterprise-pattern defensive programs (2026-08-30)</w:t>
+      </w:r>
+    </w:p>
+    <w:p>
+      <w:pPr/>
+      <w:r>
+        <w:t>Cycles 31-33 add three native, clickable Local SOC programs inspired by enterprise defensive patterns while preserving Angerona's local-first and defensive-only authority model.</w:t>
+      </w:r>
+    </w:p>
+    <w:p>
+      <w:pPr>
+        <w:pStyle w:val="ListBullet"/>
+      </w:pPr>
+      <w:r>
+        <w:t>Fleet Center / Fleet Fabric Lab: sealed enrollment grants, durable device bindings, bounded authenticated health and loss evidence, and governed desired-versus-effective rollout/canary evaluation. No remote transport, dispatch, HA, distributed quota, or production mTLS coordination service is implemented.</w:t>
+      </w:r>
+    </w:p>
+    <w:p>
+      <w:pPr>
+        <w:pStyle w:val="ListBullet"/>
+      </w:pPr>
+      <w:r>
+        <w:t>DetectionForge: immutable replay cohorts, exact active-candidate diffs, a physically separate alert-inert shadow lane, chained quality receipts, and fresh one-use promotion or rollback receipts. It is local governed evaluation, not a distributed content service.</w:t>
+      </w:r>
+    </w:p>
+    <w:p>
+      <w:pPr>
+        <w:pStyle w:val="ListBullet"/>
+      </w:pPr>
+      <w:r>
+        <w:t>AegisPath: evidence-bound exposure graphs, bounded confirmed and speculative paths, choke and blast analysis, inert breakpoint counterfactuals, and explainable KEV/EPSS/criticality priority. It does not claim exploitability, breach probability, reachability proof, or remediation proof.</w:t>
+      </w:r>
+    </w:p>
+    <w:p>
+      <w:pPr>
+        <w:pStyle w:val="ListBullet"/>
+      </w:pPr>
+      <w:r>
+        <w:t>Adversarial closure: 31 initial findings (11 High, 18 Medium, 2 Low) were fixed; independent re-attacks found 15 additional bypasses, all fixed. The final bounded gates found no reopened issue.</w:t>
+      </w:r>
+    </w:p>
+    <w:p>
+      <w:pPr>
+        <w:pStyle w:val="ListBullet"/>
+      </w:pPr>
+      <w:r>
+        <w:t>Inventory and QA: 84 capabilities (9 native, 75 adapters); compile 368/368; module harness 69 pass, 16 expected skips, 0 fail; selfcheck 26/26. The pre-documentation full serial recorded 2,788 passed, 13 intentional skips, and one expected stale README-marker failure corrected by the v1.13.0 documentation update; the final release rerun remains pending.</w:t>
+      </w:r>
+    </w:p>
+    <w:p>
+      <w:pPr>
+        <w:pStyle w:val="ListBullet"/>
+      </w:pPr>
+      <w:r>
+        <w:t>Trust limits: local fleet SQLite/HMAC is not an independent rollback witness; DetectionForge needs process isolation for forcible evaluator termination and an external anchor for all-file rollback; AegisPath provider and absence authority are local trust, and its simulation is inert.</w:t>
+      </w:r>
+    </w:p>
+    <w:p>
+      <w:pPr/>
+      <w:r>
+        <w:t>The synthetic public demonstration is docs/screenshots/angerona-v1.13-enterprise-programs.png. It contains synthetic data only and is not production telemetry, a scale benchmark, independent certification, or commercial EDR/XDR parity evidence.</w:t>
       </w:r>
     </w:p>
     <w:p>
@@ -12384,7 +12475,7 @@
           <w:i w:val="0"/>
           <w:color w:val="243447"/>
         </w:rPr>
-        <w:t>Repository evidence: analysis/loop/LOOP_LOG.md; analysis/loop/cycle23, cycle24, and cycle25 research and round1-round3 findings, dispositions, remediation, bug-test, performance, comparison, and final summaries; analysis/capability_inventory_v12.json; and the current source/tests.</w:t>
+        <w:t>Repository evidence: analysis/loop/LOOP_LOG.md; preserved historical cycle records; analysis/loop/cycles31-33-summary.md and cycle31 through cycle33 implementation, adversarial, remediation, re-attack, performance, and QA records; analysis/capability_inventory_v12.json; and the current source/tests.</w:t>
       </w:r>
     </w:p>
     <w:p>

</xml_diff>

<commit_message>
docs: record v1.13 terminal release evidence
</commit_message>
<xml_diff>
--- a/Angerona_Master_Manual.docx
+++ b/Angerona_Master_Manual.docx
@@ -328,16 +328,8 @@
             </w:tcMar>
           </w:tcPr>
           <w:p>
-            <w:pPr>
-              <w:spacing w:after="0" w:line="264" w:lineRule="auto"/>
-            </w:pPr>
             <w:r>
-              <w:rPr>
-                <w:rFonts w:ascii="Calibri" w:hAnsi="Calibri" w:eastAsia="Calibri"/>
-                <w:color w:val="243447"/>
-                <w:sz w:val="18"/>
-              </w:rPr>
-              <w:t>Cycles 31-33 implementation, remediation, independent re-attack, performance, and documentation complete; final post-documentation validation and publication pending</w:t>
+              <w:t>Cycles 31-33 implementation, remediation, independent re-attack, performance, documentation, and authoritative release validation complete; guarded publication pending</w:t>
             </w:r>
           </w:p>
         </w:tc>
@@ -8092,10 +8084,7 @@
           </w:tcPr>
           <w:p>
             <w:r>
-              <w:rPr>
-                <w:sz w:val="19"/>
-              </w:rPr>
-              <w:t>Pre-documentation full serial: 2,788 passed; 13 intentional host/platform skips; 1 expected README-marker drift failure (81 versus 84). Final post-documentation rerun pending.</w:t>
+              <w:t>Authoritative five-check release gate on exact commit edefd8b07b94da4d682a35ace23057e7b22c3790: 2,790 passed; 13 intentional host/platform skips; 0 failed; 325.19 seconds. Evidence-manifest SHA-256: 23fd1c70b5b227f45175570eee14774a1693d93f1fe4e8cb914b8ce9a5d2b813. Historical pre-documentation result: 2,788 passed / 13 intentional skips / 1 expected stale-marker drift failure, since corrected.</w:t>
             </w:r>
           </w:p>
         </w:tc>
@@ -11740,7 +11729,7 @@
         <w:pStyle w:val="ListBullet"/>
       </w:pPr>
       <w:r>
-        <w:t>Inventory and QA: 84 capabilities (9 native, 75 adapters); compile 368/368; module harness 69 pass, 16 expected skips, 0 fail; selfcheck 26/26. The pre-documentation full serial recorded 2,788 passed, 13 intentional skips, and one expected stale README-marker failure corrected by the v1.13.0 documentation update; the final release rerun remains pending.</w:t>
+        <w:t>Inventory and QA: 84 capabilities (9 native, 75 adapters); compile 368/368; module harness 69 pass, 16 expected skips, 0 fail; selfcheck 26/26. The historical pre-documentation full serial recorded 2,788 passed, 13 intentional skips, and one expected stale README-marker failure, which the v1.13.0 documentation corrected. The authoritative five-check release gate on exact commit edefd8b07b94da4d682a35ace23057e7b22c3790 passed 2,790 tests with 13 intentional platform skips and 0 failures in 325.19 seconds. Evidence-manifest SHA-256: 23fd1c70b5b227f45175570eee14774a1693d93f1fe4e8cb914b8ce9a5d2b813. Validation is complete; guarded publication remains pending.</w:t>
       </w:r>
     </w:p>
     <w:p>

</xml_diff>

<commit_message>
fix: close hosted secret scan false positives
</commit_message>
<xml_diff>
--- a/Angerona_Master_Manual.docx
+++ b/Angerona_Master_Manual.docx
@@ -329,7 +329,7 @@
           </w:tcPr>
           <w:p>
             <w:r>
-              <w:t>Cycles 31-33 implementation, remediation, independent re-attack, performance, documentation, and authoritative release validation complete; guarded publication pending</w:t>
+              <w:t>Cycles 31-33 implementation, remediation, independent re-attack, performance, documentation, and authoritative release validation complete. Repository policy requires the guarded publisher for release completion.</w:t>
             </w:r>
           </w:p>
         </w:tc>
@@ -11729,7 +11729,7 @@
         <w:pStyle w:val="ListBullet"/>
       </w:pPr>
       <w:r>
-        <w:t>Inventory and QA: 84 capabilities (9 native, 75 adapters); compile 368/368; module harness 69 pass, 16 expected skips, 0 fail; selfcheck 26/26. The historical pre-documentation full serial recorded 2,788 passed, 13 intentional skips, and one expected stale README-marker failure, which the v1.13.0 documentation corrected. The authoritative five-check release gate on exact commit edefd8b07b94da4d682a35ace23057e7b22c3790 passed 2,790 tests with 13 intentional platform skips and 0 failures in 325.19 seconds. Evidence-manifest SHA-256: 23fd1c70b5b227f45175570eee14774a1693d93f1fe4e8cb914b8ce9a5d2b813. Validation is complete; guarded publication remains pending.</w:t>
+        <w:t>Inventory and QA: 84 capabilities (9 native, 75 adapters); compile 368/368; module harness 69 pass, 16 expected skips, 0 fail; selfcheck 26/26. The historical pre-documentation full serial recorded 2,788 passed, 13 intentional skips, and one expected stale README-marker failure, which the v1.13.0 documentation corrected. The authoritative five-check release gate on exact commit edefd8b07b94da4d682a35ace23057e7b22c3790 passed 2,790 tests with 13 intentional platform skips and 0 failures in 325.19 seconds. Evidence-manifest SHA-256: 23fd1c70b5b227f45175570eee14774a1693d93f1fe4e8cb914b8ce9a5d2b813. Validation is complete. Repository policy requires the guarded publisher for release completion.</w:t>
       </w:r>
     </w:p>
     <w:p>

</xml_diff>

<commit_message>
Harden Cycle 34 defensive convergence
</commit_message>
<xml_diff>
--- a/Angerona_Master_Manual.docx
+++ b/Angerona_Master_Manual.docx
@@ -110,7 +110,7 @@
           </w:tcPr>
           <w:p>
             <w:r>
-              <w:t>Current release: v1.13.0 - local Fleet Center, DetectionForge, and AegisPath enterprise-pattern programs; independent adversarial re-attacks; bounded evidence; and explicit non-parity limits.</w:t>
+              <w:t>Current release: v1.13.0 with Cycle 34 post-release defensive convergence across governed detection authority, Fleet custody and lifecycle, loopback canvas isolation, AegisPath lookup bounds, and coherent publisher-key validation.</w:t>
             </w:r>
           </w:p>
         </w:tc>
@@ -151,9 +151,17 @@
       </w:r>
     </w:p>
     <w:p>
-      <w:r>
-        <w:br w:type="page"/>
-      </w:r>
+      <w:pPr>
+        <w:sectPr>
+          <w:type w:val="nextPage"/>
+          <w:headerReference w:type="default" r:id="rId12"/>
+          <w:footerReference w:type="default" r:id="rId11"/>
+          <w:pgSz w:w="12240" w:h="15840"/>
+          <w:pgMar w:top="1440" w:right="1440" w:bottom="1440" w:left="1440" w:header="708" w:footer="708" w:gutter="0"/>
+          <w:cols w:space="720"/>
+          <w:docGrid w:linePitch="360"/>
+        </w:sectPr>
+      </w:pPr>
     </w:p>
     <w:p>
       <w:pPr>
@@ -329,7 +337,7 @@
           </w:tcPr>
           <w:p>
             <w:r>
-              <w:t>Cycles 31-33 implementation, remediation, independent re-attack, performance, documentation, and authoritative release validation complete. Repository policy requires the guarded publisher for release completion.</w:t>
+              <w:t>Cycle 34 three-round convergence and targeted validation complete; commit-bound release validation and guarded GitHub publication pending</w:t>
             </w:r>
           </w:p>
         </w:tc>
@@ -487,7 +495,7 @@
                 <w:color w:val="243447"/>
                 <w:sz w:val="18"/>
               </w:rPr>
-              <w:t>Current repository code, the 84-capability machine-readable inventory, and analysis/loop/cycles31-33-summary.md as of 30 August 2026</w:t>
+              <w:t>Current repository code, the unchanged 84-capability inventory, and analysis/loop/cycle34 evidence as of 30 August 2026</w:t>
             </w:r>
           </w:p>
         </w:tc>
@@ -1548,12 +1556,13 @@
     </w:tbl>
     <w:p>
       <w:pPr>
-        <w:spacing w:after="40"/>
+        <w:spacing w:after="80"/>
       </w:pPr>
     </w:p>
     <w:p>
       <w:pPr>
         <w:pStyle w:val="Heading2"/>
+        <w:spacing w:before="120" w:after="80"/>
       </w:pPr>
       <w:r>
         <w:t>1.2 Recommended starting posture</w:t>
@@ -1565,6 +1574,7 @@
           <w:ilvl w:val="0"/>
           <w:numId w:val="12"/>
         </w:numPr>
+        <w:spacing w:before="0" w:after="20" w:line="252" w:lineRule="auto"/>
       </w:pPr>
       <w:r>
         <w:rPr>
@@ -1580,6 +1590,7 @@
           <w:ilvl w:val="0"/>
           <w:numId w:val="12"/>
         </w:numPr>
+        <w:spacing w:before="0" w:after="20" w:line="252" w:lineRule="auto"/>
       </w:pPr>
       <w:r>
         <w:rPr>
@@ -1595,6 +1606,7 @@
           <w:ilvl w:val="0"/>
           <w:numId w:val="12"/>
         </w:numPr>
+        <w:spacing w:before="0" w:after="20" w:line="252" w:lineRule="auto"/>
       </w:pPr>
       <w:r>
         <w:rPr>
@@ -1610,6 +1622,7 @@
           <w:ilvl w:val="0"/>
           <w:numId w:val="12"/>
         </w:numPr>
+        <w:spacing w:before="0" w:after="20" w:line="252" w:lineRule="auto"/>
       </w:pPr>
       <w:r>
         <w:rPr>
@@ -1625,6 +1638,7 @@
           <w:ilvl w:val="0"/>
           <w:numId w:val="12"/>
         </w:numPr>
+        <w:spacing w:before="0" w:after="20" w:line="252" w:lineRule="auto"/>
       </w:pPr>
       <w:r>
         <w:rPr>
@@ -1654,13 +1668,16 @@
         <w:gridCol w:w="9360"/>
       </w:tblGrid>
       <w:tr>
+        <w:trPr>
+          <w:cantSplit/>
+        </w:trPr>
         <w:tc>
           <w:tcPr>
             <w:tcW w:type="dxa" w:w="9360"/>
             <w:vAlign w:val="center"/>
             <w:tcMar>
-              <w:top w:w="80" w:type="dxa"/>
-              <w:bottom w:w="80" w:type="dxa"/>
+              <w:top w:w="40" w:type="dxa"/>
+              <w:bottom w:w="40" w:type="dxa"/>
               <w:start w:w="120" w:type="dxa"/>
               <w:end w:w="120" w:type="dxa"/>
             </w:tcMar>
@@ -8084,7 +8101,7 @@
           </w:tcPr>
           <w:p>
             <w:r>
-              <w:t>Authoritative five-check release gate on exact commit edefd8b07b94da4d682a35ace23057e7b22c3790: 2,790 passed; 13 intentional host/platform skips; 0 failed; 325.19 seconds. Evidence-manifest SHA-256: 23fd1c70b5b227f45175570eee14774a1693d93f1fe4e8cb914b8ce9a5d2b813. Historical pre-documentation result: 2,788 passed / 13 intentional skips / 1 expected stale-marker drift failure, since corrected.</w:t>
+              <w:t>Cycle 34 pre-documentation serial: 2,877 passed; 14 intentional host/platform skips; one Cycle 27 Windows child-start deadline miss. The exact combat/ETW lease case then passed 2/2 after bounded timeout hardening. Commit-bound terminal release gate pending.</w:t>
             </w:r>
           </w:p>
         </w:tc>
@@ -8185,7 +8202,7 @@
                 <w:color w:val="243447"/>
                 <w:sz w:val="19"/>
               </w:rPr>
-              <w:t>Ruff clean; 84 capabilities discovered with zero errors; 9 native contracts and 75 compatibility adapters; workflow policy 3/3</w:t>
+              <w:t>Ruff clean; 84 capabilities discovered with zero errors or duplicate codes; Cycle 34 targeted matrix 91 passed with two expected Windows host-capability skips (symlink creation and POSIX fork); adjacent Cycle 31-33 matrix 128/128</w:t>
             </w:r>
           </w:p>
         </w:tc>
@@ -8234,7 +8251,7 @@
               <w:rPr>
                 <w:sz w:val="19"/>
               </w:rPr>
-              <w:t>69 pass; 16 expected platform, disabled, or optional-prerequisite skips; 0 failed</w:t>
+              <w:t>93 passed; 16 expected platform, disabled, or optional-prerequisite skips; 0 failed across module and standalone core gates</w:t>
             </w:r>
           </w:p>
         </w:tc>
@@ -9317,6 +9334,326 @@
           </w:p>
         </w:tc>
       </w:tr>
+      <w:tr>
+        <w:tc>
+          <w:tcPr>
+            <w:tcW w:type="dxa" w:w="2600"/>
+            <w:shd w:fill="FAFBFC"/>
+            <w:vAlign w:val="center"/>
+            <w:tcMar>
+              <w:top w:w="80" w:type="dxa"/>
+              <w:bottom w:w="80" w:type="dxa"/>
+              <w:start w:w="120" w:type="dxa"/>
+              <w:end w:w="120" w:type="dxa"/>
+            </w:tcMar>
+          </w:tcPr>
+          <w:p>
+            <w:pPr>
+              <w:spacing w:after="40" w:line="264" w:lineRule="auto"/>
+            </w:pPr>
+            <w:r>
+              <w:rPr>
+                <w:rFonts w:ascii="Calibri" w:hAnsi="Calibri" w:eastAsia="Calibri"/>
+                <w:color w:val="243447"/>
+                <w:sz w:val="18"/>
+              </w:rPr>
+              <w:t>AegisPath immutable selection indexes</w:t>
+            </w:r>
+          </w:p>
+        </w:tc>
+        <w:tc>
+          <w:tcPr>
+            <w:tcW w:type="dxa" w:w="2600"/>
+            <w:shd w:fill="FAFBFC"/>
+            <w:vAlign w:val="center"/>
+            <w:tcMar>
+              <w:top w:w="80" w:type="dxa"/>
+              <w:bottom w:w="80" w:type="dxa"/>
+              <w:start w:w="120" w:type="dxa"/>
+              <w:end w:w="120" w:type="dxa"/>
+            </w:tcMar>
+          </w:tcPr>
+          <w:p>
+            <w:pPr>
+              <w:spacing w:after="40" w:line="264" w:lineRule="auto"/>
+            </w:pPr>
+            <w:r>
+              <w:rPr>
+                <w:rFonts w:ascii="Calibri" w:hAnsi="Calibri" w:eastAsia="Calibri"/>
+                <w:color w:val="243447"/>
+                <w:sz w:val="18"/>
+              </w:rPr>
+              <w:t>Path lookup ~1,358x; node lookup ~8,908x in bounded fixtures</w:t>
+            </w:r>
+          </w:p>
+        </w:tc>
+        <w:tc>
+          <w:tcPr>
+            <w:tcW w:type="dxa" w:w="4160"/>
+            <w:shd w:fill="FAFBFC"/>
+            <w:vAlign w:val="center"/>
+            <w:tcMar>
+              <w:top w:w="80" w:type="dxa"/>
+              <w:bottom w:w="80" w:type="dxa"/>
+              <w:start w:w="120" w:type="dxa"/>
+              <w:end w:w="120" w:type="dxa"/>
+            </w:tcMar>
+          </w:tcPr>
+          <w:p>
+            <w:pPr>
+              <w:spacing w:after="40" w:line="264" w:lineRule="auto"/>
+            </w:pPr>
+            <w:r>
+              <w:rPr>
+                <w:rFonts w:ascii="Calibri" w:hAnsi="Calibri" w:eastAsia="Calibri"/>
+                <w:color w:val="243447"/>
+                <w:sz w:val="18"/>
+              </w:rPr>
+              <w:t>Exact evidence-bound graph and selection semantics retained</w:t>
+            </w:r>
+          </w:p>
+        </w:tc>
+      </w:tr>
+      <w:tr>
+        <w:tc>
+          <w:tcPr>
+            <w:tcW w:type="dxa" w:w="2600"/>
+            <w:shd w:fill="FAFBFC"/>
+            <w:vAlign w:val="center"/>
+            <w:tcMar>
+              <w:top w:w="80" w:type="dxa"/>
+              <w:bottom w:w="80" w:type="dxa"/>
+              <w:start w:w="120" w:type="dxa"/>
+              <w:end w:w="120" w:type="dxa"/>
+            </w:tcMar>
+          </w:tcPr>
+          <w:p>
+            <w:pPr>
+              <w:spacing w:after="40" w:line="264" w:lineRule="auto"/>
+            </w:pPr>
+            <w:r>
+              <w:rPr>
+                <w:rFonts w:ascii="Calibri" w:hAnsi="Calibri" w:eastAsia="Calibri"/>
+                <w:color w:val="243447"/>
+                <w:sz w:val="18"/>
+              </w:rPr>
+              <w:t>Fleet authenticated custody fast path</w:t>
+            </w:r>
+          </w:p>
+        </w:tc>
+        <w:tc>
+          <w:tcPr>
+            <w:tcW w:type="dxa" w:w="2600"/>
+            <w:shd w:fill="FAFBFC"/>
+            <w:vAlign w:val="center"/>
+            <w:tcMar>
+              <w:top w:w="80" w:type="dxa"/>
+              <w:bottom w:w="80" w:type="dxa"/>
+              <w:start w:w="120" w:type="dxa"/>
+              <w:end w:w="120" w:type="dxa"/>
+            </w:tcMar>
+          </w:tcPr>
+          <w:p>
+            <w:pPr>
+              <w:spacing w:after="40" w:line="264" w:lineRule="auto"/>
+            </w:pPr>
+            <w:r>
+              <w:rPr>
+                <w:rFonts w:ascii="Calibri" w:hAnsi="Calibri" w:eastAsia="Calibri"/>
+                <w:color w:val="243447"/>
+                <w:sz w:val="18"/>
+              </w:rPr>
+              <w:t>250 retained rows ~744.6 ms to 18.8 ms; 5,000-row cached intake ~289 ms</w:t>
+            </w:r>
+          </w:p>
+        </w:tc>
+        <w:tc>
+          <w:tcPr>
+            <w:tcW w:type="dxa" w:w="4160"/>
+            <w:shd w:fill="FAFBFC"/>
+            <w:vAlign w:val="center"/>
+            <w:tcMar>
+              <w:top w:w="80" w:type="dxa"/>
+              <w:bottom w:w="80" w:type="dxa"/>
+              <w:start w:w="120" w:type="dxa"/>
+              <w:end w:w="120" w:type="dxa"/>
+            </w:tcMar>
+          </w:tcPr>
+          <w:p>
+            <w:pPr>
+              <w:spacing w:after="40" w:line="264" w:lineRule="auto"/>
+            </w:pPr>
+            <w:r>
+              <w:rPr>
+                <w:rFonts w:ascii="Calibri" w:hAnsi="Calibri" w:eastAsia="Calibri"/>
+                <w:color w:val="243447"/>
+                <w:sz w:val="18"/>
+              </w:rPr>
+              <w:t>Full startup audit, 5,000-row/8 KiB caps, cache invalidation, and rollback checks retained</w:t>
+            </w:r>
+          </w:p>
+        </w:tc>
+      </w:tr>
+      <w:tr>
+        <w:tc>
+          <w:tcPr>
+            <w:tcW w:type="dxa" w:w="2600"/>
+            <w:shd w:fill="FAFBFC"/>
+            <w:vAlign w:val="center"/>
+            <w:tcMar>
+              <w:top w:w="80" w:type="dxa"/>
+              <w:bottom w:w="80" w:type="dxa"/>
+              <w:start w:w="120" w:type="dxa"/>
+              <w:end w:w="120" w:type="dxa"/>
+            </w:tcMar>
+          </w:tcPr>
+          <w:p>
+            <w:pPr>
+              <w:spacing w:after="40" w:line="264" w:lineRule="auto"/>
+            </w:pPr>
+            <w:r>
+              <w:rPr>
+                <w:rFonts w:ascii="Calibri" w:hAnsi="Calibri" w:eastAsia="Calibri"/>
+                <w:color w:val="243447"/>
+                <w:sz w:val="18"/>
+              </w:rPr>
+              <w:t>Detection Runtime decode coalescing</w:t>
+            </w:r>
+          </w:p>
+        </w:tc>
+        <w:tc>
+          <w:tcPr>
+            <w:tcW w:type="dxa" w:w="2600"/>
+            <w:shd w:fill="FAFBFC"/>
+            <w:vAlign w:val="center"/>
+            <w:tcMar>
+              <w:top w:w="80" w:type="dxa"/>
+              <w:bottom w:w="80" w:type="dxa"/>
+              <w:start w:w="120" w:type="dxa"/>
+              <w:end w:w="120" w:type="dxa"/>
+            </w:tcMar>
+          </w:tcPr>
+          <w:p>
+            <w:pPr>
+              <w:spacing w:after="40" w:line="264" w:lineRule="auto"/>
+            </w:pPr>
+            <w:r>
+              <w:rPr>
+                <w:rFonts w:ascii="Calibri" w:hAnsi="Calibri" w:eastAsia="Calibri"/>
+                <w:color w:val="243447"/>
+                <w:sz w:val="18"/>
+              </w:rPr>
+              <w:t>1,920 to 30 decodes; ~4.0x evaluated-event throughput</w:t>
+            </w:r>
+          </w:p>
+        </w:tc>
+        <w:tc>
+          <w:tcPr>
+            <w:tcW w:type="dxa" w:w="4160"/>
+            <w:shd w:fill="FAFBFC"/>
+            <w:vAlign w:val="center"/>
+            <w:tcMar>
+              <w:top w:w="80" w:type="dxa"/>
+              <w:bottom w:w="80" w:type="dxa"/>
+              <w:start w:w="120" w:type="dxa"/>
+              <w:end w:w="120" w:type="dxa"/>
+            </w:tcMar>
+          </w:tcPr>
+          <w:p>
+            <w:pPr>
+              <w:spacing w:after="40" w:line="264" w:lineRule="auto"/>
+            </w:pPr>
+            <w:r>
+              <w:rPr>
+                <w:rFonts w:ascii="Calibri" w:hAnsi="Calibri" w:eastAsia="Calibri"/>
+                <w:color w:val="243447"/>
+                <w:sz w:val="18"/>
+              </w:rPr>
+              <w:t>Per-rule budgets, malformed-event failures, shadow isolation, and rate gates retained</w:t>
+            </w:r>
+          </w:p>
+        </w:tc>
+      </w:tr>
+      <w:tr>
+        <w:tc>
+          <w:tcPr>
+            <w:tcW w:type="dxa" w:w="2600"/>
+            <w:shd w:fill="FAFBFC"/>
+            <w:vAlign w:val="center"/>
+            <w:tcMar>
+              <w:top w:w="80" w:type="dxa"/>
+              <w:bottom w:w="80" w:type="dxa"/>
+              <w:start w:w="120" w:type="dxa"/>
+              <w:end w:w="120" w:type="dxa"/>
+            </w:tcMar>
+          </w:tcPr>
+          <w:p>
+            <w:pPr>
+              <w:spacing w:after="40" w:line="264" w:lineRule="auto"/>
+            </w:pPr>
+            <w:r>
+              <w:rPr>
+                <w:rFonts w:ascii="Calibri" w:hAnsi="Calibri" w:eastAsia="Calibri"/>
+                <w:color w:val="243447"/>
+                <w:sz w:val="18"/>
+              </w:rPr>
+              <w:t>Coherent registry validation</w:t>
+            </w:r>
+          </w:p>
+        </w:tc>
+        <w:tc>
+          <w:tcPr>
+            <w:tcW w:type="dxa" w:w="2600"/>
+            <w:shd w:fill="FAFBFC"/>
+            <w:vAlign w:val="center"/>
+            <w:tcMar>
+              <w:top w:w="80" w:type="dxa"/>
+              <w:bottom w:w="80" w:type="dxa"/>
+              <w:start w:w="120" w:type="dxa"/>
+              <w:end w:w="120" w:type="dxa"/>
+            </w:tcMar>
+          </w:tcPr>
+          <w:p>
+            <w:pPr>
+              <w:spacing w:after="40" w:line="264" w:lineRule="auto"/>
+            </w:pPr>
+            <w:r>
+              <w:rPr>
+                <w:rFonts w:ascii="Calibri" w:hAnsi="Calibri" w:eastAsia="Calibri"/>
+                <w:color w:val="243447"/>
+                <w:sz w:val="18"/>
+              </w:rPr>
+              <w:t>64 to 2 governance reads; publisher trust reads reduced from N to 2</w:t>
+            </w:r>
+          </w:p>
+        </w:tc>
+        <w:tc>
+          <w:tcPr>
+            <w:tcW w:type="dxa" w:w="4160"/>
+            <w:shd w:fill="FAFBFC"/>
+            <w:vAlign w:val="center"/>
+            <w:tcMar>
+              <w:top w:w="80" w:type="dxa"/>
+              <w:bottom w:w="80" w:type="dxa"/>
+              <w:start w:w="120" w:type="dxa"/>
+              <w:end w:w="120" w:type="dxa"/>
+            </w:tcMar>
+          </w:tcPr>
+          <w:p>
+            <w:pPr>
+              <w:spacing w:after="40" w:line="264" w:lineRule="auto"/>
+            </w:pPr>
+            <w:r>
+              <w:rPr>
+                <w:rFonts w:ascii="Calibri" w:hAnsi="Calibri" w:eastAsia="Calibri"/>
+                <w:color w:val="243447"/>
+                <w:sz w:val="18"/>
+              </w:rPr>
+              <w:t>Immutable key snapshot plus exit identity/hash and stable artifact generations</w:t>
+            </w:r>
+          </w:p>
+        </w:tc>
+      </w:tr>
     </w:tbl>
     <w:p>
       <w:pPr>
@@ -9399,7 +9736,8 @@
     <w:p>
       <w:pPr>
         <w:pStyle w:val="Heading1"/>
-        <w:pageBreakBefore/>
+        <w:keepNext/>
+        <w:pageBreakBefore w:val="0"/>
       </w:pPr>
       <w:r>
         <w:t>15. Security posture, limits, and external gates</w:t>
@@ -9439,7 +9777,7 @@
           </w:tcPr>
           <w:p>
             <w:r>
-              <w:t>Final red-team verdict: Cycles 31-33 fixed 31 initial findings and 15 independently discovered re-attack bypasses. No reviewed issue reopened in the final bounded gates. Fleet transport/HA, independent rollback anchors, provider PKI, clean-machine scale trials, and independent efficacy remain external work.</w:t>
+              <w:t>Final red-team verdict: Cycle 34 fixed five Round 1 findings, the Round 2 detection/lifecycle and Fleet retained-evidence findings, and every Round 3 replay, ownership, cache, quota, migration, quarantine, and trust-coherence bypass. Final focused re-attacks found no open Critical, High, or Medium release blocker. Full-root rollback still needs an external witness, and Fleet remains a bounded local lab.</w:t>
             </w:r>
           </w:p>
         </w:tc>
@@ -11255,6 +11593,40 @@
           </w:p>
         </w:tc>
       </w:tr>
+      <w:tr>
+        <w:tc>
+          <w:tcPr>
+            <w:tcW w:type="dxa" w:w="1550"/>
+          </w:tcPr>
+          <w:p>
+            <w:pPr>
+              <w:spacing w:after="40"/>
+            </w:pPr>
+            <w:r>
+              <w:rPr>
+                <w:sz w:val="18"/>
+              </w:rPr>
+              <w:t>1.13.0 / Cycle 34 maintenance</w:t>
+            </w:r>
+          </w:p>
+        </w:tc>
+        <w:tc>
+          <w:tcPr>
+            <w:tcW w:type="dxa" w:w="7810"/>
+          </w:tcPr>
+          <w:p>
+            <w:pPr>
+              <w:spacing w:after="40"/>
+            </w:pPr>
+            <w:r>
+              <w:rPr>
+                <w:sz w:val="18"/>
+              </w:rPr>
+              <w:t>Governed detection owner/time/quarantine convergence; coherent publisher trust; authenticated bounded Fleet custody and restart-safe transactional quotas; isolated loopback canvas; AegisPath and Detection Runtime performance hardening.</w:t>
+            </w:r>
+          </w:p>
+        </w:tc>
+      </w:tr>
     </w:tbl>
     <w:p>
       <w:pPr>
@@ -11744,6 +12116,70 @@
       <w:pPr/>
       <w:r>
         <w:t>The synthetic public demonstration is docs/screenshots/angerona-v1.13-enterprise-programs.png. It contains synthetic data only and is not production telemetry, a scale benchmark, independent certification, or commercial EDR/XDR parity evidence.</w:t>
+      </w:r>
+    </w:p>
+    <w:p>
+      <w:pPr>
+        <w:pStyle w:val="Heading2"/>
+        <w:keepNext/>
+        <w:pageBreakBefore/>
+      </w:pPr>
+      <w:r>
+        <w:t>17.9 v1.13.0 Cycle 34 defensive convergence maintenance (2026-08-30)</w:t>
+      </w:r>
+    </w:p>
+    <w:p>
+      <w:pPr/>
+      <w:r>
+        <w:t>Cycle 34 is a three-round post-v1.13 defensive convergence pass. It keeps version 1.13.0 and the 84-capability inventory unchanged; no proposal-only research item was relabeled as shipped behavior.</w:t>
+      </w:r>
+    </w:p>
+    <w:p>
+      <w:pPr>
+        <w:pStyle w:val="ListBullet"/>
+      </w:pPr>
+      <w:r>
+        <w:t>Round 1 closed repository-wide canvas exposure, legacy detection governance bypass, detached runtime ownership, multi-package eviction, and an unbound Fleet monitor. AegisPath gained immutable path/node indexes.</w:t>
+      </w:r>
+    </w:p>
+    <w:p>
+      <w:pPr>
+        <w:pStyle w:val="ListBullet"/>
+      </w:pPr>
+      <w:r>
+        <w:t>Round 2 bound detection state, registry, runtime, receipts, expiry, and recovery into one fail-closed authority; hardened descriptor-only canvas serving and cancellable Local SOC startup; authenticated every retained Fleet health row; and replaced 3N+1 repeated signature verification with a guarded exact-row custody projection.</w:t>
+      </w:r>
+    </w:p>
+    <w:p>
+      <w:pPr>
+        <w:pStyle w:val="ListBullet"/>
+      </w:pPr>
+      <w:r>
+        <w:t>Round 3 added a nondecreasing promotion time floor, creator-PID-bound runtime-owner lease tied to exact registry/state/quality/policy/clock/path authority with fork-safe descriptor reset, governance anchor, journaled quarantine convergence, safe legacy migration, zero-mutation invalid/replay intake, restart-safe Fleet quotas, transactional quota reservation, and coherent publisher-key snapshots across multi-package validation.</w:t>
+      </w:r>
+    </w:p>
+    <w:p>
+      <w:pPr/>
+      <w:r>
+        <w:t>Performance evidence is bounded and reproducible: Detection Runtime reduced representative JSON decodes from 1,920 to 30 (~4x throughput); registry governance reads fell from 64 to 2; Fleet's 250-row cached path fell from about 744.6 ms to 18.8 ms; and AegisPath path/node lookup work improved by roughly 1,358x/8,908x in its declared fixtures.</w:t>
+      </w:r>
+    </w:p>
+    <w:p>
+      <w:pPr/>
+      <w:r>
+        <w:t>Final targeted evidence: Cycle 34 91 passed with two expected Windows host-capability skips (symlink creation and POSIX fork); adjacent Cycle 31-33 coverage 128/128; 368/368 package files compiled; 93 self-tests passed with 16 expected skips and zero failures; application selfcheck 26/26; final migration malformed-history matrix 16/16 and owner crash/reopen/quarantine probes clean.</w:t>
+      </w:r>
+    </w:p>
+    <w:p>
+      <w:pPr/>
+      <w:r>
+        <w:t>Residual boundary: local HMAC/SQLite/file anchors cannot prove freshness against rollback of the entire trusted root. Truncated or unprovable legacy detection history requires explicit operator recovery. Fleet is still a local lab with no remote transport, dispatch, HA, distributed quota, or production mTLS service; its 5,000-row retention bound may conservatively delay post-prune restart intake until refill.</w:t>
+      </w:r>
+    </w:p>
+    <w:p>
+      <w:pPr/>
+      <w:r>
+        <w:t>Proposal-only next work includes Runtime Custody Lease Broker (best future MVP), Domain Writer Fencing Tokens, View-Bound Action Receipts, Invariant Failure Capsules, Disposable Authority Recovery Rehearsal, Authoritative Mutation Inventory Gate, Cross-Domain Commit Envelope, and Forward-Integrity Ledger Epochs. None is implemented by this maintenance cycle.</w:t>
       </w:r>
     </w:p>
     <w:p>
@@ -13275,13 +13711,9 @@
     <w:sectPr>
       <w:headerReference w:type="default" r:id="rId9"/>
       <w:footerReference w:type="default" r:id="rId10"/>
-      <w:footerReference w:type="first" r:id="rId11"/>
-      <w:headerReference w:type="first" r:id="rId12"/>
-      <w:headerReference w:type="even" r:id="rId13"/>
       <w:pgSz w:w="12240" w:h="15840"/>
       <w:pgMar w:top="1440" w:right="1440" w:bottom="1440" w:left="1440" w:header="708" w:footer="708" w:gutter="0"/>
       <w:cols w:space="720"/>
-      <w:titlePg/>
       <w:docGrid w:linePitch="360"/>
     </w:sectPr>
   </w:body>
@@ -13358,10 +13790,38 @@
               <w:color w:val="667085"/>
               <w:sz w:val="18"/>
             </w:rPr>
-            <w:fldChar w:fldCharType="begin"/>
+            <w:fldChar w:fldCharType="begin" w:dirty="true"/>
+          </w:r>
+          <w:r>
+            <w:rPr>
+              <w:rFonts w:ascii="Calibri" w:hAnsi="Calibri" w:eastAsia="Calibri"/>
+              <w:color w:val="667085"/>
+              <w:sz w:val="18"/>
+            </w:rPr>
             <w:instrText xml:space="preserve"> PAGE </w:instrText>
+          </w:r>
+          <w:r>
+            <w:rPr>
+              <w:rFonts w:ascii="Calibri" w:hAnsi="Calibri" w:eastAsia="Calibri"/>
+              <w:color w:val="667085"/>
+              <w:sz w:val="18"/>
+            </w:rPr>
             <w:fldChar w:fldCharType="separate"/>
+          </w:r>
+          <w:r>
+            <w:rPr>
+              <w:rFonts w:ascii="Calibri" w:hAnsi="Calibri" w:eastAsia="Calibri"/>
+              <w:color w:val="667085"/>
+              <w:sz w:val="18"/>
+            </w:rPr>
             <w:t>1</w:t>
+          </w:r>
+          <w:r>
+            <w:rPr>
+              <w:rFonts w:ascii="Calibri" w:hAnsi="Calibri" w:eastAsia="Calibri"/>
+              <w:color w:val="667085"/>
+              <w:sz w:val="18"/>
+            </w:rPr>
             <w:fldChar w:fldCharType="end"/>
           </w:r>
         </w:p>
@@ -13384,7 +13844,7 @@
         <w:color w:val="667085"/>
         <w:sz w:val="17"/>
       </w:rPr>
-      <w:t>Angerona Suite  |  v1.12.0  |  28 August 2026</w:t>
+      <w:t>Angerona Suite  |  v1.13.0  |  30 August 2026</w:t>
     </w:r>
   </w:p>
 </w:ftr>
@@ -13404,23 +13864,13 @@
         <w:color w:val="667085"/>
         <w:sz w:val="17"/>
       </w:rPr>
-      <w:t>ANGERONA  |  MASTER MANUAL  |  v1.12.0</w:t>
+      <w:t>ANGERONA  |  MASTER MANUAL  |  v1.13.0</w:t>
     </w:r>
   </w:p>
 </w:hdr>
 </file>
 
 <file path=word/header2.xml><?xml version="1.0" encoding="utf-8"?>
-<w:hdr xmlns:m="http://schemas.openxmlformats.org/officeDocument/2006/math" xmlns:mc="http://schemas.openxmlformats.org/markup-compatibility/2006" xmlns:mo="http://schemas.microsoft.com/office/mac/office/2008/main" xmlns:mv="urn:schemas-microsoft-com:mac:vml" xmlns:o="urn:schemas-microsoft-com:office:office" xmlns:r="http://schemas.openxmlformats.org/officeDocument/2006/relationships" xmlns:v="urn:schemas-microsoft-com:vml" xmlns:w10="urn:schemas-microsoft-com:office:word" xmlns:w14="http://schemas.microsoft.com/office/word/2010/wordml" xmlns:w="http://schemas.openxmlformats.org/wordprocessingml/2006/main" xmlns:wne="http://schemas.microsoft.com/office/word/2006/wordml" xmlns:wp14="http://schemas.microsoft.com/office/word/2010/wordprocessingDrawing" xmlns:wp="http://schemas.openxmlformats.org/drawingml/2006/wordprocessingDrawing" xmlns:wpc="http://schemas.microsoft.com/office/word/2010/wordprocessingCanvas" xmlns:wpg="http://schemas.microsoft.com/office/word/2010/wordprocessingGroup" xmlns:wpi="http://schemas.microsoft.com/office/word/2010/wordprocessingInk" xmlns:wps="http://schemas.microsoft.com/office/word/2010/wordprocessingShape" mc:Ignorable="w14 wp14">
-  <w:p>
-    <w:pPr>
-      <w:pStyle w:val="Header"/>
-    </w:pPr>
-  </w:p>
-</w:hdr>
-</file>
-
-<file path=word/header3.xml><?xml version="1.0" encoding="utf-8"?>
 <w:hdr xmlns:m="http://schemas.openxmlformats.org/officeDocument/2006/math" xmlns:mc="http://schemas.openxmlformats.org/markup-compatibility/2006" xmlns:mo="http://schemas.microsoft.com/office/mac/office/2008/main" xmlns:mv="urn:schemas-microsoft-com:mac:vml" xmlns:o="urn:schemas-microsoft-com:office:office" xmlns:r="http://schemas.openxmlformats.org/officeDocument/2006/relationships" xmlns:v="urn:schemas-microsoft-com:vml" xmlns:w10="urn:schemas-microsoft-com:office:word" xmlns:w14="http://schemas.microsoft.com/office/word/2010/wordml" xmlns:w="http://schemas.openxmlformats.org/wordprocessingml/2006/main" xmlns:wne="http://schemas.microsoft.com/office/word/2006/wordml" xmlns:wp14="http://schemas.microsoft.com/office/word/2010/wordprocessingDrawing" xmlns:wp="http://schemas.openxmlformats.org/drawingml/2006/wordprocessingDrawing" xmlns:wpc="http://schemas.microsoft.com/office/word/2010/wordprocessingCanvas" xmlns:wpg="http://schemas.microsoft.com/office/word/2010/wordprocessingGroup" xmlns:wpi="http://schemas.microsoft.com/office/word/2010/wordprocessingInk" xmlns:wps="http://schemas.microsoft.com/office/word/2010/wordprocessingShape" mc:Ignorable="w14 wp14">
   <w:p>
     <w:pPr>

</xml_diff>

<commit_message>
Seal Cycle 34 release evidence
</commit_message>
<xml_diff>
--- a/Angerona_Master_Manual.docx
+++ b/Angerona_Master_Manual.docx
@@ -337,7 +337,7 @@
           </w:tcPr>
           <w:p>
             <w:r>
-              <w:t>Cycle 34 three-round convergence and targeted validation complete; commit-bound release validation and guarded GitHub publication pending</w:t>
+              <w:t>Cycle 34 three-round convergence and commit-bound release validation complete; GitHub publication is restricted to the guarded canonical publisher</w:t>
             </w:r>
           </w:p>
         </w:tc>
@@ -8101,7 +8101,7 @@
           </w:tcPr>
           <w:p>
             <w:r>
-              <w:t>Cycle 34 pre-documentation serial: 2,877 passed; 14 intentional host/platform skips; one Cycle 27 Windows child-start deadline miss. The exact combat/ETW lease case then passed 2/2 after bounded timeout hardening. Commit-bound terminal release gate pending.</w:t>
+              <w:t>2882 passed / 15 intentional platform skips / 0 failed in 977.10 seconds (0:16:17)</w:t>
             </w:r>
           </w:p>
         </w:tc>
@@ -12180,6 +12180,12 @@
       <w:pPr/>
       <w:r>
         <w:t>Proposal-only next work includes Runtime Custody Lease Broker (best future MVP), Domain Writer Fencing Tokens, View-Bound Action Receipts, Invariant Failure Capsules, Disposable Authority Recovery Rehearsal, Authoritative Mutation Inventory Gate, Cross-Domain Commit Envelope, and Forward-Integrity Ledger Epochs. None is implemented by this maintenance cycle.</w:t>
+      </w:r>
+    </w:p>
+    <w:p>
+      <w:pPr/>
+      <w:r>
+        <w:t>Commit-bound five-check release evidence passed on 7eef1f0a0c400b34f170cbd1463cd3c6a454de3b. Evidence-manifest SHA-256: 8a6b294ea04157f9232fee5567ac2fb8cb45664cb8f3c74b73c08717ba816d8c. GitHub publication remains governed by tools/publish_github_update.py.</w:t>
       </w:r>
     </w:p>
     <w:p>

</xml_diff>